<commit_message>
Updated local environment setup instructions
</commit_message>
<xml_diff>
--- a/doc/development/HPC Development Environment Setup.docx
+++ b/doc/development/HPC Development Environment Setup.docx
@@ -1443,6 +1443,22 @@
                 <w:t>, updated DB section</w:t>
               </w:r>
             </w:ins>
+            <w:ins w:id="14" w:author="Menon, Sunita (NIH/NCI) [C]" w:date="2021-06-14T00:15:00Z">
+              <w:r>
+                <w:rPr>
+                  <w:rFonts w:cs="Arial"/>
+                </w:rPr>
+                <w:t>, added</w:t>
+              </w:r>
+            </w:ins>
+            <w:ins w:id="15" w:author="Menon, Sunita (NIH/NCI) [C]" w:date="2021-06-14T00:25:00Z">
+              <w:r>
+                <w:rPr>
+                  <w:rFonts w:cs="Arial"/>
+                </w:rPr>
+                <w:t>/updated some steps</w:t>
+              </w:r>
+            </w:ins>
           </w:p>
         </w:tc>
       </w:tr>
@@ -2428,14 +2444,14 @@
       <w:pPr>
         <w:pStyle w:val="Heading1"/>
       </w:pPr>
-      <w:bookmarkStart w:id="14" w:name="_Toc505280670"/>
+      <w:bookmarkStart w:id="16" w:name="_Toc505280670"/>
       <w:r>
         <w:t>Git</w:t>
       </w:r>
       <w:r>
         <w:t xml:space="preserve"> Code Repository</w:t>
       </w:r>
-      <w:bookmarkEnd w:id="14"/>
+      <w:bookmarkEnd w:id="16"/>
     </w:p>
     <w:p>
       <w:pPr>
@@ -2541,14 +2557,14 @@
       <w:pPr>
         <w:pStyle w:val="Heading1"/>
       </w:pPr>
-      <w:bookmarkStart w:id="15" w:name="_Toc505280671"/>
+      <w:bookmarkStart w:id="17" w:name="_Toc505280671"/>
       <w:r>
         <w:t>J</w:t>
       </w:r>
       <w:r>
         <w:t>ava Development Kit (JDK)</w:t>
       </w:r>
-      <w:bookmarkEnd w:id="15"/>
+      <w:bookmarkEnd w:id="17"/>
     </w:p>
     <w:p>
       <w:pPr>
@@ -2598,11 +2614,11 @@
       <w:pPr>
         <w:pStyle w:val="Heading1"/>
       </w:pPr>
-      <w:bookmarkStart w:id="16" w:name="_Toc505280672"/>
+      <w:bookmarkStart w:id="18" w:name="_Toc505280672"/>
       <w:r>
         <w:t>MAVEN</w:t>
       </w:r>
-      <w:bookmarkEnd w:id="16"/>
+      <w:bookmarkEnd w:id="18"/>
     </w:p>
     <w:p>
       <w:pPr>
@@ -2669,11 +2685,11 @@
       <w:pPr>
         <w:pStyle w:val="Heading1"/>
       </w:pPr>
-      <w:bookmarkStart w:id="17" w:name="_Toc505280673"/>
+      <w:bookmarkStart w:id="19" w:name="_Toc505280673"/>
       <w:r>
         <w:t>SERVICEMIX</w:t>
       </w:r>
-      <w:bookmarkEnd w:id="17"/>
+      <w:bookmarkEnd w:id="19"/>
     </w:p>
     <w:p>
       <w:pPr>
@@ -3342,7 +3358,7 @@
         <w:t>hpc.integration.ldap.password</w:t>
       </w:r>
       <w:proofErr w:type="spellEnd"/>
-      <w:del w:id="18" w:author="Menon, Sunita (NIH/NCI) [C]" w:date="2021-06-13T23:53:00Z">
+      <w:del w:id="20" w:author="Menon, Sunita (NIH/NCI) [C]" w:date="2021-06-13T23:53:00Z">
         <w:r>
           <w:delText xml:space="preserve"> properties</w:delText>
         </w:r>
@@ -3389,12 +3405,12 @@
       <w:r>
         <w:t>hpc.dao.</w:t>
       </w:r>
-      <w:ins w:id="19" w:author="Menon, Sunita (NIH/NCI) [C]" w:date="2021-06-13T23:52:00Z">
+      <w:ins w:id="21" w:author="Menon, Sunita (NIH/NCI) [C]" w:date="2021-06-13T23:52:00Z">
         <w:r>
           <w:t>oracle</w:t>
         </w:r>
       </w:ins>
-      <w:del w:id="20" w:author="Menon, Sunita (NIH/NCI) [C]" w:date="2021-06-13T23:52:00Z">
+      <w:del w:id="22" w:author="Menon, Sunita (NIH/NCI) [C]" w:date="2021-06-13T23:52:00Z">
         <w:r>
           <w:delText>postgresql</w:delText>
         </w:r>
@@ -3558,7 +3574,7 @@
       <w:pPr>
         <w:pStyle w:val="Heading1"/>
       </w:pPr>
-      <w:bookmarkStart w:id="21" w:name="_Toc505280674"/>
+      <w:bookmarkStart w:id="23" w:name="_Toc505280674"/>
     </w:p>
     <w:p>
       <w:pPr>
@@ -3570,7 +3586,7 @@
       <w:r>
         <w:t xml:space="preserve"> DB</w:t>
       </w:r>
-      <w:bookmarkEnd w:id="21"/>
+      <w:bookmarkEnd w:id="23"/>
       <w:r>
         <w:t xml:space="preserve"> </w:t>
       </w:r>
@@ -3584,10 +3600,10 @@
       <w:pPr>
         <w:ind w:left="216"/>
       </w:pPr>
-      <w:ins w:id="22" w:author="Menon, Sunita (NIH/NCI) [C]" w:date="2021-06-13T23:47:00Z">
-        <w:r>
-          <w:rPr>
-            <w:rPrChange w:id="23" w:author="Menon, Sunita (NIH/NCI) [C]" w:date="2021-06-13T23:47:00Z">
+      <w:ins w:id="24" w:author="Menon, Sunita (NIH/NCI) [C]" w:date="2021-06-13T23:47:00Z">
+        <w:r>
+          <w:rPr>
+            <w:rPrChange w:id="25" w:author="Menon, Sunita (NIH/NCI) [C]" w:date="2021-06-13T23:47:00Z">
               <w:rPr>
                 <w:b/>
                 <w:bCs/>
@@ -3597,10 +3613,10 @@
           <w:t xml:space="preserve">Ensure that the </w:t>
         </w:r>
       </w:ins>
-      <w:ins w:id="24" w:author="Menon, Sunita (NIH/NCI) [C]" w:date="2021-06-13T23:46:00Z">
-        <w:r>
-          <w:rPr>
-            <w:rPrChange w:id="25" w:author="Menon, Sunita (NIH/NCI) [C]" w:date="2021-06-13T23:47:00Z">
+      <w:ins w:id="26" w:author="Menon, Sunita (NIH/NCI) [C]" w:date="2021-06-13T23:46:00Z">
+        <w:r>
+          <w:rPr>
+            <w:rPrChange w:id="27" w:author="Menon, Sunita (NIH/NCI) [C]" w:date="2021-06-13T23:47:00Z">
               <w:rPr>
                 <w:b/>
                 <w:bCs/>
@@ -3610,10 +3626,10 @@
           <w:t xml:space="preserve">property file </w:t>
         </w:r>
       </w:ins>
-      <w:ins w:id="26" w:author="Menon, Sunita (NIH/NCI) [C]" w:date="2021-06-13T23:47:00Z">
-        <w:r>
-          <w:rPr>
-            <w:rPrChange w:id="27" w:author="Menon, Sunita (NIH/NCI) [C]" w:date="2021-06-13T23:47:00Z">
+      <w:ins w:id="28" w:author="Menon, Sunita (NIH/NCI) [C]" w:date="2021-06-13T23:47:00Z">
+        <w:r>
+          <w:rPr>
+            <w:rPrChange w:id="29" w:author="Menon, Sunita (NIH/NCI) [C]" w:date="2021-06-13T23:47:00Z">
               <w:rPr>
                 <w:b/>
                 <w:bCs/>
@@ -3630,10 +3646,10 @@
           <w:t xml:space="preserve"> </w:t>
         </w:r>
       </w:ins>
-      <w:ins w:id="28" w:author="Menon, Sunita (NIH/NCI) [C]" w:date="2021-06-13T23:48:00Z">
-        <w:r>
-          <w:rPr>
-            <w:rPrChange w:id="29" w:author="Menon, Sunita (NIH/NCI) [C]" w:date="2021-06-13T23:48:00Z">
+      <w:ins w:id="30" w:author="Menon, Sunita (NIH/NCI) [C]" w:date="2021-06-13T23:48:00Z">
+        <w:r>
+          <w:rPr>
+            <w:rPrChange w:id="31" w:author="Menon, Sunita (NIH/NCI) [C]" w:date="2021-06-13T23:48:00Z">
               <w:rPr>
                 <w:b/>
                 <w:bCs/>
@@ -3651,35 +3667,7 @@
         </w:r>
       </w:ins>
       <w:proofErr w:type="spellStart"/>
-      <w:ins w:id="30" w:author="Menon, Sunita (NIH/NCI) [C]" w:date="2021-06-13T23:46:00Z">
-        <w:r>
-          <w:rPr>
-            <w:b/>
-            <w:bCs/>
-            <w:rPrChange w:id="31" w:author="Menon, Sunita (NIH/NCI) [C]" w:date="2021-06-13T23:47:00Z">
-              <w:rPr>
-                <w:b/>
-                <w:bCs/>
-              </w:rPr>
-            </w:rPrChange>
-          </w:rPr>
-          <w:t>hpc</w:t>
-        </w:r>
-        <w:proofErr w:type="spellEnd"/>
-        <w:r>
-          <w:rPr>
-            <w:b/>
-            <w:bCs/>
-            <w:rPrChange w:id="32" w:author="Menon, Sunita (NIH/NCI) [C]" w:date="2021-06-13T23:47:00Z">
-              <w:rPr>
-                <w:b/>
-                <w:bCs/>
-              </w:rPr>
-            </w:rPrChange>
-          </w:rPr>
-          <w:t>-server-</w:t>
-        </w:r>
-        <w:proofErr w:type="spellStart"/>
+      <w:ins w:id="32" w:author="Menon, Sunita (NIH/NCI) [C]" w:date="2021-06-13T23:46:00Z">
         <w:r>
           <w:rPr>
             <w:b/>
@@ -3691,16 +3679,44 @@
               </w:rPr>
             </w:rPrChange>
           </w:rPr>
+          <w:t>hpc</w:t>
+        </w:r>
+        <w:proofErr w:type="spellEnd"/>
+        <w:r>
+          <w:rPr>
+            <w:b/>
+            <w:bCs/>
+            <w:rPrChange w:id="34" w:author="Menon, Sunita (NIH/NCI) [C]" w:date="2021-06-13T23:47:00Z">
+              <w:rPr>
+                <w:b/>
+                <w:bCs/>
+              </w:rPr>
+            </w:rPrChange>
+          </w:rPr>
+          <w:t>-server-</w:t>
+        </w:r>
+        <w:proofErr w:type="spellStart"/>
+        <w:r>
+          <w:rPr>
+            <w:b/>
+            <w:bCs/>
+            <w:rPrChange w:id="35" w:author="Menon, Sunita (NIH/NCI) [C]" w:date="2021-06-13T23:47:00Z">
+              <w:rPr>
+                <w:b/>
+                <w:bCs/>
+              </w:rPr>
+            </w:rPrChange>
+          </w:rPr>
           <w:t>local.properties</w:t>
         </w:r>
       </w:ins>
       <w:proofErr w:type="spellEnd"/>
-      <w:ins w:id="34" w:author="Menon, Sunita (NIH/NCI) [C]" w:date="2021-06-13T23:47:00Z">
+      <w:ins w:id="36" w:author="Menon, Sunita (NIH/NCI) [C]" w:date="2021-06-13T23:47:00Z">
         <w:r>
           <w:t xml:space="preserve"> is </w:t>
         </w:r>
       </w:ins>
-      <w:del w:id="35" w:author="Menon, Sunita (NIH/NCI) [C]" w:date="2021-06-13T23:45:00Z">
+      <w:del w:id="37" w:author="Menon, Sunita (NIH/NCI) [C]" w:date="2021-06-13T23:45:00Z">
         <w:r>
           <w:rPr>
             <w:b/>
@@ -3712,7 +3728,7 @@
           <w:delText>: Skip this step if you are setting up your local development environment, since y</w:delText>
         </w:r>
       </w:del>
-      <w:del w:id="36" w:author="Menon, Sunita (NIH/NCI) [C]" w:date="2021-06-13T23:47:00Z">
+      <w:del w:id="38" w:author="Menon, Sunita (NIH/NCI) [C]" w:date="2021-06-13T23:47:00Z">
         <w:r>
           <w:delText xml:space="preserve">ou will be </w:delText>
         </w:r>
@@ -3720,7 +3736,7 @@
       <w:r>
         <w:t>pointing to the already installed Dev. Environment Instance</w:t>
       </w:r>
-      <w:del w:id="37" w:author="Menon, Sunita (NIH/NCI) [C]" w:date="2021-06-13T23:48:00Z">
+      <w:del w:id="39" w:author="Menon, Sunita (NIH/NCI) [C]" w:date="2021-06-13T23:48:00Z">
         <w:r>
           <w:delText xml:space="preserve"> in </w:delText>
         </w:r>
@@ -3739,7 +3755,7 @@
       <w:pPr>
         <w:ind w:left="216"/>
         <w:rPr>
-          <w:del w:id="38" w:author="Menon, Sunita (NIH/NCI) [C]" w:date="2021-06-13T23:46:00Z"/>
+          <w:del w:id="40" w:author="Menon, Sunita (NIH/NCI) [C]" w:date="2021-06-13T23:46:00Z"/>
         </w:rPr>
       </w:pPr>
     </w:p>
@@ -3747,10 +3763,10 @@
       <w:pPr>
         <w:ind w:left="216"/>
         <w:rPr>
-          <w:del w:id="39" w:author="Menon, Sunita (NIH/NCI) [C]" w:date="2021-06-13T23:46:00Z"/>
-        </w:rPr>
-      </w:pPr>
-      <w:del w:id="40" w:author="Menon, Sunita (NIH/NCI) [C]" w:date="2021-06-13T23:46:00Z">
+          <w:del w:id="41" w:author="Menon, Sunita (NIH/NCI) [C]" w:date="2021-06-13T23:46:00Z"/>
+        </w:rPr>
+      </w:pPr>
+      <w:del w:id="42" w:author="Menon, Sunita (NIH/NCI) [C]" w:date="2021-06-13T23:46:00Z">
         <w:r>
           <w:delText>Install</w:delText>
         </w:r>
@@ -3792,10 +3808,10 @@
         </w:numPr>
         <w:jc w:val="left"/>
         <w:rPr>
-          <w:del w:id="41" w:author="Menon, Sunita (NIH/NCI) [C]" w:date="2021-06-13T23:46:00Z"/>
-        </w:rPr>
-      </w:pPr>
-      <w:del w:id="42" w:author="Menon, Sunita (NIH/NCI) [C]" w:date="2021-06-13T23:46:00Z">
+          <w:del w:id="43" w:author="Menon, Sunita (NIH/NCI) [C]" w:date="2021-06-13T23:46:00Z"/>
+        </w:rPr>
+      </w:pPr>
+      <w:del w:id="44" w:author="Menon, Sunita (NIH/NCI) [C]" w:date="2021-06-13T23:46:00Z">
         <w:r>
           <w:delText>Execute a</w:delText>
         </w:r>
@@ -3828,10 +3844,10 @@
         </w:numPr>
         <w:jc w:val="left"/>
         <w:rPr>
-          <w:del w:id="43" w:author="Menon, Sunita (NIH/NCI) [C]" w:date="2021-06-13T23:46:00Z"/>
-        </w:rPr>
-      </w:pPr>
-      <w:del w:id="44" w:author="Menon, Sunita (NIH/NCI) [C]" w:date="2021-06-13T23:46:00Z">
+          <w:del w:id="45" w:author="Menon, Sunita (NIH/NCI) [C]" w:date="2021-06-13T23:46:00Z"/>
+        </w:rPr>
+      </w:pPr>
+      <w:del w:id="46" w:author="Menon, Sunita (NIH/NCI) [C]" w:date="2021-06-13T23:46:00Z">
         <w:r>
           <w:rPr>
             <w:color w:val="3B2322"/>
@@ -3855,10 +3871,10 @@
         </w:numPr>
         <w:jc w:val="left"/>
         <w:rPr>
-          <w:del w:id="45" w:author="Menon, Sunita (NIH/NCI) [C]" w:date="2021-06-13T23:46:00Z"/>
-        </w:rPr>
-      </w:pPr>
-      <w:del w:id="46" w:author="Menon, Sunita (NIH/NCI) [C]" w:date="2021-06-13T23:46:00Z">
+          <w:del w:id="47" w:author="Menon, Sunita (NIH/NCI) [C]" w:date="2021-06-13T23:46:00Z"/>
+        </w:rPr>
+      </w:pPr>
+      <w:del w:id="48" w:author="Menon, Sunita (NIH/NCI) [C]" w:date="2021-06-13T23:46:00Z">
         <w:r>
           <w:rPr>
             <w:color w:val="3B2322"/>
@@ -3876,10 +3892,10 @@
         </w:numPr>
         <w:jc w:val="left"/>
         <w:rPr>
-          <w:del w:id="47" w:author="Menon, Sunita (NIH/NCI) [C]" w:date="2021-06-13T23:46:00Z"/>
-        </w:rPr>
-      </w:pPr>
-      <w:del w:id="48" w:author="Menon, Sunita (NIH/NCI) [C]" w:date="2021-06-13T23:46:00Z">
+          <w:del w:id="49" w:author="Menon, Sunita (NIH/NCI) [C]" w:date="2021-06-13T23:46:00Z"/>
+        </w:rPr>
+      </w:pPr>
+      <w:del w:id="50" w:author="Menon, Sunita (NIH/NCI) [C]" w:date="2021-06-13T23:46:00Z">
         <w:r>
           <w:delText>Execute SQL scripts intended for DEV environment (they end with ‘dev’ in the script name’) in $HPC_HOME/hpc-server/hpc-dao-impl/src/main/scripts/restore.</w:delText>
         </w:r>
@@ -3894,10 +3910,10 @@
         </w:numPr>
         <w:jc w:val="left"/>
         <w:rPr>
-          <w:del w:id="49" w:author="Menon, Sunita (NIH/NCI) [C]" w:date="2021-06-13T23:46:00Z"/>
-        </w:rPr>
-      </w:pPr>
-      <w:del w:id="50" w:author="Menon, Sunita (NIH/NCI) [C]" w:date="2021-06-13T23:46:00Z">
+          <w:del w:id="51" w:author="Menon, Sunita (NIH/NCI) [C]" w:date="2021-06-13T23:46:00Z"/>
+        </w:rPr>
+      </w:pPr>
+      <w:del w:id="52" w:author="Menon, Sunita (NIH/NCI) [C]" w:date="2021-06-13T23:46:00Z">
         <w:r>
           <w:delText>Manually insert a row into HPC_USER table using your info (NIH user-id, first-name, last-name, etc)</w:delText>
         </w:r>
@@ -3912,11 +3928,11 @@
       <w:pPr>
         <w:pStyle w:val="Heading1"/>
       </w:pPr>
-      <w:bookmarkStart w:id="51" w:name="_Toc505280675"/>
+      <w:bookmarkStart w:id="53" w:name="_Toc505280675"/>
       <w:r>
         <w:t>IRODS</w:t>
       </w:r>
-      <w:bookmarkEnd w:id="51"/>
+      <w:bookmarkEnd w:id="53"/>
     </w:p>
     <w:p>
       <w:pPr>
@@ -3931,13 +3947,13 @@
       </w:r>
       <w:proofErr w:type="spellEnd"/>
       <w:r>
-        <w:t xml:space="preserve"> account in the DEV environment. Ask a team member to register you as an HPC-DM user in the DEV </w:t>
-      </w:r>
-      <w:proofErr w:type="gramStart"/>
-      <w:r>
-        <w:t>environment..</w:t>
-      </w:r>
-      <w:proofErr w:type="gramEnd"/>
+        <w:t xml:space="preserve"> account in the DEV environment. Ask a team member to register you as an HPC-DM user in the DEV environment.</w:t>
+      </w:r>
+      <w:del w:id="54" w:author="Menon, Sunita (NIH/NCI) [C]" w:date="2021-06-14T00:21:00Z">
+        <w:r>
+          <w:delText>.</w:delText>
+        </w:r>
+      </w:del>
       <w:r>
         <w:t xml:space="preserve"> The registration in DEV will create your </w:t>
       </w:r>
@@ -3959,14 +3975,14 @@
       <w:pPr>
         <w:pStyle w:val="Heading1"/>
       </w:pPr>
-      <w:bookmarkStart w:id="52" w:name="_Toc505280676"/>
+      <w:bookmarkStart w:id="55" w:name="_Toc505280676"/>
       <w:r>
         <w:t>PATH</w:t>
       </w:r>
       <w:r>
         <w:t xml:space="preserve"> Environment Variable</w:t>
       </w:r>
-      <w:bookmarkEnd w:id="52"/>
+      <w:bookmarkEnd w:id="55"/>
     </w:p>
     <w:p>
       <w:pPr>
@@ -4023,11 +4039,11 @@
       <w:pPr>
         <w:pStyle w:val="Heading1"/>
       </w:pPr>
-      <w:bookmarkStart w:id="53" w:name="_Toc505280677"/>
+      <w:bookmarkStart w:id="56" w:name="_Toc505280677"/>
       <w:r>
         <w:t>BUILD</w:t>
       </w:r>
-      <w:bookmarkEnd w:id="53"/>
+      <w:bookmarkEnd w:id="56"/>
     </w:p>
     <w:p>
       <w:pPr>
@@ -4138,20 +4154,45 @@
         <w:t>all</w:t>
       </w:r>
       <w:r>
-        <w:t xml:space="preserve"> HPC DME software products.  This could be </w:t>
-      </w:r>
-      <w:r>
-        <w:t>overkill</w:t>
-      </w:r>
-      <w:r>
-        <w:t>, and consequently you spend more time</w:t>
-      </w:r>
-      <w:r>
-        <w:t xml:space="preserve"> executing a build than </w:t>
-      </w:r>
-      <w:r>
-        <w:t>necessary due to building products that you do not need</w:t>
-      </w:r>
+        <w:t xml:space="preserve"> HPC DME software products.  This </w:t>
+      </w:r>
+      <w:ins w:id="57" w:author="Menon, Sunita (NIH/NCI) [C]" w:date="2021-06-14T00:17:00Z">
+        <w:r>
+          <w:t xml:space="preserve">is required the first time you do the build. After that, </w:t>
+        </w:r>
+      </w:ins>
+      <w:ins w:id="58" w:author="Menon, Sunita (NIH/NCI) [C]" w:date="2021-06-14T00:19:00Z">
+        <w:r>
+          <w:t xml:space="preserve">if you wish, </w:t>
+        </w:r>
+      </w:ins>
+      <w:ins w:id="59" w:author="Menon, Sunita (NIH/NCI) [C]" w:date="2021-06-14T00:18:00Z">
+        <w:r>
+          <w:t>you can exclude the modules you do not need</w:t>
+        </w:r>
+      </w:ins>
+      <w:ins w:id="60" w:author="Menon, Sunita (NIH/NCI) [C]" w:date="2021-06-14T00:19:00Z">
+        <w:r>
+          <w:t xml:space="preserve"> to save build time</w:t>
+        </w:r>
+      </w:ins>
+      <w:del w:id="61" w:author="Menon, Sunita (NIH/NCI) [C]" w:date="2021-06-14T00:19:00Z">
+        <w:r>
+          <w:delText xml:space="preserve">could be </w:delText>
+        </w:r>
+        <w:r>
+          <w:delText>overkill</w:delText>
+        </w:r>
+        <w:r>
+          <w:delText>, and consequently you spend more time</w:delText>
+        </w:r>
+        <w:r>
+          <w:delText xml:space="preserve"> executing a build than </w:delText>
+        </w:r>
+        <w:r>
+          <w:delText>necessary due to building products that you do not need</w:delText>
+        </w:r>
+      </w:del>
       <w:r>
         <w:t>.</w:t>
       </w:r>
@@ -4622,7 +4663,7 @@
       <w:pPr>
         <w:pStyle w:val="Heading1"/>
       </w:pPr>
-      <w:bookmarkStart w:id="54" w:name="_Toc505280678"/>
+      <w:bookmarkStart w:id="62" w:name="_Toc505280678"/>
       <w:r>
         <w:t>DEPLOY</w:t>
       </w:r>
@@ -4635,7 +4676,7 @@
       <w:r>
         <w:t>to SERVICEMIX</w:t>
       </w:r>
-      <w:bookmarkEnd w:id="54"/>
+      <w:bookmarkEnd w:id="62"/>
     </w:p>
     <w:p>
       <w:pPr>
@@ -4845,7 +4886,6 @@
         </w:rPr>
         <w:t xml:space="preserve"> </w:t>
       </w:r>
-      <w:proofErr w:type="spellStart"/>
       <w:r>
         <w:rPr>
           <w:rFonts w:ascii="Courier" w:hAnsi="Courier"/>
@@ -4853,37 +4893,7 @@
           <w:sz w:val="22"/>
           <w:szCs w:val="22"/>
         </w:rPr>
-        <w:t>mvn:gov.nih.nci.hpc</w:t>
-      </w:r>
-      <w:proofErr w:type="spellEnd"/>
-      <w:r>
-        <w:rPr>
-          <w:rFonts w:ascii="Courier" w:hAnsi="Courier"/>
-          <w:color w:val="3B2322"/>
-          <w:sz w:val="22"/>
-          <w:szCs w:val="22"/>
-        </w:rPr>
-        <w:t>/</w:t>
-      </w:r>
-      <w:proofErr w:type="spellStart"/>
-      <w:r>
-        <w:rPr>
-          <w:rFonts w:ascii="Courier" w:hAnsi="Courier"/>
-          <w:color w:val="3B2322"/>
-          <w:sz w:val="22"/>
-          <w:szCs w:val="22"/>
-        </w:rPr>
-        <w:t>hpc</w:t>
-      </w:r>
-      <w:proofErr w:type="spellEnd"/>
-      <w:r>
-        <w:rPr>
-          <w:rFonts w:ascii="Courier" w:hAnsi="Courier"/>
-          <w:color w:val="3B2322"/>
-          <w:sz w:val="22"/>
-          <w:szCs w:val="22"/>
-        </w:rPr>
-        <w:t>-features</w:t>
+        <w:t>mvn:gov.nih.nci.hpc/hpc-features</w:t>
       </w:r>
       <w:r>
         <w:rPr>
@@ -4903,7 +4913,66 @@
           <w:sz w:val="22"/>
           <w:szCs w:val="22"/>
         </w:rPr>
-        <w:t>&lt;server-version&gt;</w:t>
+        <w:t>&lt;</w:t>
+      </w:r>
+      <w:ins w:id="63" w:author="Menon, Sunita (NIH/NCI) [C]" w:date="2021-06-14T00:12:00Z">
+        <w:r>
+          <w:rPr>
+            <w:rFonts w:ascii="Courier" w:hAnsi="Courier"/>
+            <w:iCs/>
+            <w:color w:val="3B2322"/>
+            <w:sz w:val="22"/>
+            <w:szCs w:val="22"/>
+            <w:rPrChange w:id="64" w:author="Menon, Sunita (NIH/NCI) [C]" w:date="2021-06-14T00:12:00Z">
+              <w:rPr>
+                <w:rFonts w:ascii="Courier" w:hAnsi="Courier"/>
+                <w:i/>
+                <w:color w:val="3B2322"/>
+                <w:sz w:val="22"/>
+                <w:szCs w:val="22"/>
+              </w:rPr>
+            </w:rPrChange>
+          </w:rPr>
+          <w:t>hpc-</w:t>
+        </w:r>
+      </w:ins>
+      <w:r>
+        <w:rPr>
+          <w:rFonts w:ascii="Courier" w:hAnsi="Courier"/>
+          <w:iCs/>
+          <w:color w:val="3B2322"/>
+          <w:sz w:val="22"/>
+          <w:szCs w:val="22"/>
+          <w:rPrChange w:id="65" w:author="Menon, Sunita (NIH/NCI) [C]" w:date="2021-06-14T00:12:00Z">
+            <w:rPr>
+              <w:rFonts w:ascii="Courier" w:hAnsi="Courier"/>
+              <w:i/>
+              <w:color w:val="3B2322"/>
+              <w:sz w:val="22"/>
+              <w:szCs w:val="22"/>
+            </w:rPr>
+          </w:rPrChange>
+        </w:rPr>
+        <w:t>server</w:t>
+      </w:r>
+      <w:r>
+        <w:rPr>
+          <w:rFonts w:ascii="Courier" w:hAnsi="Courier"/>
+          <w:iCs/>
+          <w:color w:val="3B2322"/>
+          <w:sz w:val="22"/>
+          <w:szCs w:val="22"/>
+          <w:rPrChange w:id="66" w:author="Menon, Sunita (NIH/NCI) [C]" w:date="2021-06-14T00:10:00Z">
+            <w:rPr>
+              <w:rFonts w:ascii="Courier" w:hAnsi="Courier"/>
+              <w:i/>
+              <w:color w:val="3B2322"/>
+              <w:sz w:val="22"/>
+              <w:szCs w:val="22"/>
+            </w:rPr>
+          </w:rPrChange>
+        </w:rPr>
+        <w:t>-version</w:t>
       </w:r>
       <w:r>
         <w:rPr>
@@ -4913,6 +4982,16 @@
           <w:sz w:val="22"/>
           <w:szCs w:val="22"/>
         </w:rPr>
+        <w:t>&gt;</w:t>
+      </w:r>
+      <w:r>
+        <w:rPr>
+          <w:rFonts w:ascii="Courier" w:hAnsi="Courier"/>
+          <w:i/>
+          <w:color w:val="3B2322"/>
+          <w:sz w:val="22"/>
+          <w:szCs w:val="22"/>
+        </w:rPr>
         <w:t>/</w:t>
       </w:r>
       <w:r>
@@ -5002,6 +5081,175 @@
         </w:rPr>
         <w:t>-rest-services</w:t>
       </w:r>
+    </w:p>
+    <w:p>
+      <w:pPr>
+        <w:ind w:left="216"/>
+        <w:rPr>
+          <w:ins w:id="67" w:author="Menon, Sunita (NIH/NCI) [C]" w:date="2021-06-14T00:11:00Z"/>
+          <w:color w:val="3B2322"/>
+        </w:rPr>
+      </w:pPr>
+    </w:p>
+    <w:p>
+      <w:pPr>
+        <w:ind w:left="216"/>
+        <w:rPr>
+          <w:ins w:id="68" w:author="Menon, Sunita (NIH/NCI) [C]" w:date="2021-06-14T00:11:00Z"/>
+          <w:color w:val="3B2322"/>
+        </w:rPr>
+      </w:pPr>
+      <w:ins w:id="69" w:author="Menon, Sunita (NIH/NCI) [C]" w:date="2021-06-14T00:11:00Z">
+        <w:r>
+          <w:rPr>
+            <w:color w:val="3B2322"/>
+          </w:rPr>
+          <w:t xml:space="preserve">For example. if the </w:t>
+        </w:r>
+        <w:proofErr w:type="spellStart"/>
+        <w:r>
+          <w:rPr>
+            <w:color w:val="3B2322"/>
+          </w:rPr>
+          <w:t>hpc</w:t>
+        </w:r>
+        <w:proofErr w:type="spellEnd"/>
+        <w:r>
+          <w:rPr>
+            <w:color w:val="3B2322"/>
+          </w:rPr>
+          <w:t>-server-version is 2.8.1, then do</w:t>
+        </w:r>
+      </w:ins>
+    </w:p>
+    <w:p>
+      <w:pPr>
+        <w:ind w:left="216"/>
+        <w:jc w:val="left"/>
+        <w:rPr>
+          <w:ins w:id="70" w:author="Menon, Sunita (NIH/NCI) [C]" w:date="2021-06-14T00:11:00Z"/>
+          <w:color w:val="3B2322"/>
+        </w:rPr>
+        <w:pPrChange w:id="71" w:author="Menon, Sunita (NIH/NCI) [C]" w:date="2021-06-14T00:11:00Z">
+          <w:pPr>
+            <w:ind w:left="216"/>
+          </w:pPr>
+        </w:pPrChange>
+      </w:pPr>
+      <w:proofErr w:type="spellStart"/>
+      <w:ins w:id="72" w:author="Menon, Sunita (NIH/NCI) [C]" w:date="2021-06-14T00:11:00Z">
+        <w:r>
+          <w:rPr>
+            <w:rFonts w:ascii="Courier" w:hAnsi="Courier"/>
+            <w:color w:val="3B2322"/>
+            <w:sz w:val="22"/>
+            <w:szCs w:val="22"/>
+          </w:rPr>
+          <w:t>feature:repo-add</w:t>
+        </w:r>
+        <w:proofErr w:type="spellEnd"/>
+        <w:r>
+          <w:rPr>
+            <w:rFonts w:ascii="Courier" w:hAnsi="Courier"/>
+            <w:color w:val="3B2322"/>
+            <w:sz w:val="22"/>
+            <w:szCs w:val="22"/>
+          </w:rPr>
+          <w:t xml:space="preserve"> </w:t>
+        </w:r>
+        <w:proofErr w:type="spellStart"/>
+        <w:r>
+          <w:rPr>
+            <w:rFonts w:ascii="Courier" w:hAnsi="Courier"/>
+            <w:color w:val="3B2322"/>
+            <w:sz w:val="22"/>
+            <w:szCs w:val="22"/>
+          </w:rPr>
+          <w:t>mvn:gov.nih.nci.hpc</w:t>
+        </w:r>
+        <w:proofErr w:type="spellEnd"/>
+        <w:r>
+          <w:rPr>
+            <w:rFonts w:ascii="Courier" w:hAnsi="Courier"/>
+            <w:color w:val="3B2322"/>
+            <w:sz w:val="22"/>
+            <w:szCs w:val="22"/>
+          </w:rPr>
+          <w:t>/</w:t>
+        </w:r>
+        <w:proofErr w:type="spellStart"/>
+        <w:r>
+          <w:rPr>
+            <w:rFonts w:ascii="Courier" w:hAnsi="Courier"/>
+            <w:color w:val="3B2322"/>
+            <w:sz w:val="22"/>
+            <w:szCs w:val="22"/>
+          </w:rPr>
+          <w:t>hpc</w:t>
+        </w:r>
+        <w:proofErr w:type="spellEnd"/>
+        <w:r>
+          <w:rPr>
+            <w:rFonts w:ascii="Courier" w:hAnsi="Courier"/>
+            <w:color w:val="3B2322"/>
+            <w:sz w:val="22"/>
+            <w:szCs w:val="22"/>
+          </w:rPr>
+          <w:t>-features</w:t>
+        </w:r>
+        <w:r>
+          <w:rPr>
+            <w:rFonts w:ascii="Courier" w:hAnsi="Courier"/>
+            <w:i/>
+            <w:color w:val="3B2322"/>
+            <w:sz w:val="22"/>
+            <w:szCs w:val="22"/>
+          </w:rPr>
+          <w:t>/</w:t>
+        </w:r>
+      </w:ins>
+      <w:ins w:id="73" w:author="Menon, Sunita (NIH/NCI) [C]" w:date="2021-06-14T00:12:00Z">
+        <w:r>
+          <w:rPr>
+            <w:rFonts w:ascii="Courier" w:hAnsi="Courier"/>
+            <w:iCs/>
+            <w:color w:val="3B2322"/>
+            <w:sz w:val="22"/>
+            <w:szCs w:val="22"/>
+            <w:rPrChange w:id="74" w:author="Menon, Sunita (NIH/NCI) [C]" w:date="2021-06-14T00:12:00Z">
+              <w:rPr>
+                <w:rFonts w:ascii="Courier" w:hAnsi="Courier"/>
+                <w:i/>
+                <w:color w:val="3B2322"/>
+                <w:sz w:val="22"/>
+                <w:szCs w:val="22"/>
+              </w:rPr>
+            </w:rPrChange>
+          </w:rPr>
+          <w:t>2.8.1</w:t>
+        </w:r>
+      </w:ins>
+      <w:ins w:id="75" w:author="Menon, Sunita (NIH/NCI) [C]" w:date="2021-06-14T00:11:00Z">
+        <w:r>
+          <w:rPr>
+            <w:rFonts w:ascii="Courier" w:hAnsi="Courier"/>
+            <w:i/>
+            <w:color w:val="3B2322"/>
+            <w:sz w:val="22"/>
+            <w:szCs w:val="22"/>
+          </w:rPr>
+          <w:t>/</w:t>
+        </w:r>
+        <w:r>
+          <w:rPr>
+            <w:rFonts w:ascii="Courier" w:hAnsi="Courier"/>
+            <w:color w:val="3B2322"/>
+            <w:sz w:val="22"/>
+            <w:szCs w:val="22"/>
+          </w:rPr>
+          <w:t>xml/features</w:t>
+        </w:r>
+      </w:ins>
     </w:p>
     <w:p>
       <w:pPr>
@@ -5209,11 +5457,11 @@
       <w:pPr>
         <w:pStyle w:val="Heading1"/>
       </w:pPr>
-      <w:bookmarkStart w:id="55" w:name="_Toc505280679"/>
+      <w:bookmarkStart w:id="76" w:name="_Toc505280679"/>
       <w:r>
         <w:t>ENDPOINTS</w:t>
       </w:r>
-      <w:bookmarkEnd w:id="55"/>
+      <w:bookmarkEnd w:id="76"/>
     </w:p>
     <w:p>
       <w:pPr>
@@ -5239,7 +5487,6 @@
         <w:ind w:left="0" w:firstLine="216"/>
       </w:pPr>
       <w:r>
-        <w:lastRenderedPageBreak/>
         <w:t>This is the URL to be used for accessing the services from SOAP-UI</w:t>
       </w:r>
       <w:r>
@@ -5259,14 +5506,14 @@
       <w:pPr>
         <w:pStyle w:val="Heading1"/>
       </w:pPr>
-      <w:bookmarkStart w:id="56" w:name="_Toc505280681"/>
+      <w:bookmarkStart w:id="77" w:name="_Toc505280681"/>
       <w:r>
         <w:t xml:space="preserve">HPCDME </w:t>
       </w:r>
       <w:r>
         <w:t>WEB Client</w:t>
       </w:r>
-      <w:bookmarkEnd w:id="56"/>
+      <w:bookmarkEnd w:id="77"/>
     </w:p>
     <w:p>
       <w:pPr>
@@ -5421,230 +5668,240 @@
           <w:sz w:val="22"/>
           <w:szCs w:val="22"/>
         </w:rPr>
-        <w:t>=5015 –jar target/&lt;</w:t>
+        <w:t>=5015 –jar target/</w:t>
       </w:r>
       <w:proofErr w:type="spellStart"/>
-      <w:r>
-        <w:rPr>
-          <w:rFonts w:ascii="Courier" w:hAnsi="Courier"/>
-          <w:sz w:val="22"/>
-          <w:szCs w:val="22"/>
-        </w:rPr>
-        <w:t>hpc</w:t>
-      </w:r>
-      <w:proofErr w:type="spellEnd"/>
-      <w:r>
-        <w:rPr>
-          <w:rFonts w:ascii="Courier" w:hAnsi="Courier"/>
-          <w:sz w:val="22"/>
-          <w:szCs w:val="22"/>
-        </w:rPr>
-        <w:t>-web</w:t>
-      </w:r>
-      <w:r>
-        <w:rPr>
-          <w:rFonts w:ascii="Courier" w:hAnsi="Courier"/>
-          <w:sz w:val="22"/>
-          <w:szCs w:val="22"/>
-        </w:rPr>
-        <w:t xml:space="preserve">-&lt;version number&gt;.war </w:t>
-      </w:r>
-    </w:p>
-    <w:p>
-      <w:pPr>
-        <w:ind w:left="216"/>
-      </w:pPr>
-    </w:p>
-    <w:p>
-      <w:pPr>
-        <w:ind w:left="216"/>
-      </w:pPr>
-      <w:r>
-        <w:t xml:space="preserve">For </w:t>
-      </w:r>
-      <w:proofErr w:type="gramStart"/>
-      <w:r>
-        <w:t>e.g.</w:t>
-      </w:r>
-      <w:proofErr w:type="gramEnd"/>
-      <w:r>
-        <w:t xml:space="preserve"> if the version number is </w:t>
-      </w:r>
-      <w:ins w:id="57" w:author="Menon, Sunita (NIH/NCI) [C]" w:date="2021-06-13T23:49:00Z">
-        <w:r>
-          <w:t>2</w:t>
-        </w:r>
-      </w:ins>
-      <w:del w:id="58" w:author="Menon, Sunita (NIH/NCI) [C]" w:date="2021-06-13T23:49:00Z">
-        <w:r>
-          <w:delText>1</w:delText>
-        </w:r>
-      </w:del>
-      <w:r>
-        <w:t>.</w:t>
-      </w:r>
-      <w:ins w:id="59" w:author="Menon, Sunita (NIH/NCI) [C]" w:date="2021-06-13T23:49:00Z">
-        <w:r>
-          <w:t>8</w:t>
-        </w:r>
-      </w:ins>
-      <w:del w:id="60" w:author="Menon, Sunita (NIH/NCI) [C]" w:date="2021-06-13T23:49:00Z">
-        <w:r>
-          <w:delText>1</w:delText>
-        </w:r>
-        <w:r>
-          <w:delText>6</w:delText>
-        </w:r>
-      </w:del>
-      <w:r>
-        <w:t xml:space="preserve">.0, then </w:t>
-      </w:r>
-      <w:r>
-        <w:t>run</w:t>
-      </w:r>
-    </w:p>
-    <w:p>
-      <w:pPr>
-        <w:ind w:left="216"/>
-      </w:pPr>
-    </w:p>
-    <w:p>
-      <w:pPr>
-        <w:ind w:left="216"/>
-        <w:jc w:val="left"/>
-        <w:rPr>
-          <w:rFonts w:ascii="Courier" w:hAnsi="Courier"/>
-          <w:sz w:val="22"/>
-          <w:szCs w:val="22"/>
-        </w:rPr>
-      </w:pPr>
-      <w:r>
-        <w:rPr>
-          <w:rFonts w:ascii="Courier" w:hAnsi="Courier"/>
-          <w:sz w:val="22"/>
-          <w:szCs w:val="22"/>
-        </w:rPr>
-        <w:t>java –</w:t>
-      </w:r>
-      <w:proofErr w:type="spellStart"/>
-      <w:r>
-        <w:rPr>
-          <w:rFonts w:ascii="Courier" w:hAnsi="Courier"/>
-          <w:sz w:val="22"/>
-          <w:szCs w:val="22"/>
-        </w:rPr>
-        <w:t>Xdebug</w:t>
-      </w:r>
-      <w:proofErr w:type="spellEnd"/>
-      <w:r>
-        <w:rPr>
-          <w:rFonts w:ascii="Courier" w:hAnsi="Courier"/>
-          <w:sz w:val="22"/>
-          <w:szCs w:val="22"/>
-        </w:rPr>
-        <w:t xml:space="preserve"> –</w:t>
-      </w:r>
-      <w:proofErr w:type="spellStart"/>
-      <w:r>
-        <w:rPr>
-          <w:rFonts w:ascii="Courier" w:hAnsi="Courier"/>
-          <w:sz w:val="22"/>
-          <w:szCs w:val="22"/>
-        </w:rPr>
-        <w:t>Xrunjdwp:server</w:t>
-      </w:r>
-      <w:proofErr w:type="spellEnd"/>
-      <w:r>
-        <w:rPr>
-          <w:rFonts w:ascii="Courier" w:hAnsi="Courier"/>
-          <w:sz w:val="22"/>
-          <w:szCs w:val="22"/>
-        </w:rPr>
-        <w:t>=y, transport=</w:t>
-      </w:r>
-      <w:proofErr w:type="spellStart"/>
-      <w:r>
-        <w:rPr>
-          <w:rFonts w:ascii="Courier" w:hAnsi="Courier"/>
-          <w:sz w:val="22"/>
-          <w:szCs w:val="22"/>
-        </w:rPr>
-        <w:t>dt_socket,suspend</w:t>
-      </w:r>
-      <w:proofErr w:type="spellEnd"/>
-      <w:r>
-        <w:rPr>
-          <w:rFonts w:ascii="Courier" w:hAnsi="Courier"/>
-          <w:sz w:val="22"/>
-          <w:szCs w:val="22"/>
-        </w:rPr>
-        <w:t>=</w:t>
-      </w:r>
-      <w:proofErr w:type="spellStart"/>
-      <w:r>
-        <w:rPr>
-          <w:rFonts w:ascii="Courier" w:hAnsi="Courier"/>
-          <w:sz w:val="22"/>
-          <w:szCs w:val="22"/>
-        </w:rPr>
-        <w:t>n,address</w:t>
-      </w:r>
-      <w:proofErr w:type="spellEnd"/>
-      <w:r>
-        <w:rPr>
-          <w:rFonts w:ascii="Courier" w:hAnsi="Courier"/>
-          <w:sz w:val="22"/>
-          <w:szCs w:val="22"/>
-        </w:rPr>
-        <w:t>=5015 –jar target/hpc-web</w:t>
-      </w:r>
-      <w:r>
-        <w:rPr>
-          <w:rFonts w:ascii="Courier" w:hAnsi="Courier"/>
-          <w:sz w:val="22"/>
-          <w:szCs w:val="22"/>
-        </w:rPr>
-        <w:t>-</w:t>
-      </w:r>
-      <w:ins w:id="61" w:author="Menon, Sunita (NIH/NCI) [C]" w:date="2021-06-13T23:49:00Z">
+      <w:del w:id="78" w:author="Menon, Sunita (NIH/NCI) [C]" w:date="2021-06-14T00:09:00Z">
         <w:r>
           <w:rPr>
             <w:rFonts w:ascii="Courier" w:hAnsi="Courier"/>
             <w:sz w:val="22"/>
             <w:szCs w:val="22"/>
           </w:rPr>
+          <w:delText>&lt;</w:delText>
+        </w:r>
+      </w:del>
+      <w:r>
+        <w:rPr>
+          <w:rFonts w:ascii="Courier" w:hAnsi="Courier"/>
+          <w:sz w:val="22"/>
+          <w:szCs w:val="22"/>
+        </w:rPr>
+        <w:t>hpc</w:t>
+      </w:r>
+      <w:proofErr w:type="spellEnd"/>
+      <w:r>
+        <w:rPr>
+          <w:rFonts w:ascii="Courier" w:hAnsi="Courier"/>
+          <w:sz w:val="22"/>
+          <w:szCs w:val="22"/>
+        </w:rPr>
+        <w:t>-web</w:t>
+      </w:r>
+      <w:r>
+        <w:rPr>
+          <w:rFonts w:ascii="Courier" w:hAnsi="Courier"/>
+          <w:sz w:val="22"/>
+          <w:szCs w:val="22"/>
+        </w:rPr>
+        <w:t xml:space="preserve">-&lt;version number&gt;.war </w:t>
+      </w:r>
+    </w:p>
+    <w:p>
+      <w:pPr>
+        <w:ind w:left="216"/>
+      </w:pPr>
+    </w:p>
+    <w:p>
+      <w:pPr>
+        <w:ind w:left="216"/>
+      </w:pPr>
+      <w:r>
+        <w:t xml:space="preserve">For </w:t>
+      </w:r>
+      <w:proofErr w:type="gramStart"/>
+      <w:r>
+        <w:t>e.g.</w:t>
+      </w:r>
+      <w:proofErr w:type="gramEnd"/>
+      <w:r>
+        <w:t xml:space="preserve"> if the version number is </w:t>
+      </w:r>
+      <w:ins w:id="79" w:author="Menon, Sunita (NIH/NCI) [C]" w:date="2021-06-13T23:49:00Z">
+        <w:r>
           <w:t>2</w:t>
         </w:r>
       </w:ins>
-      <w:del w:id="62" w:author="Menon, Sunita (NIH/NCI) [C]" w:date="2021-06-13T23:49:00Z">
+      <w:del w:id="80" w:author="Menon, Sunita (NIH/NCI) [C]" w:date="2021-06-13T23:49:00Z">
+        <w:r>
+          <w:delText>1</w:delText>
+        </w:r>
+      </w:del>
+      <w:r>
+        <w:t>.</w:t>
+      </w:r>
+      <w:ins w:id="81" w:author="Menon, Sunita (NIH/NCI) [C]" w:date="2021-06-13T23:49:00Z">
+        <w:r>
+          <w:t>8</w:t>
+        </w:r>
+      </w:ins>
+      <w:del w:id="82" w:author="Menon, Sunita (NIH/NCI) [C]" w:date="2021-06-13T23:49:00Z">
+        <w:r>
+          <w:delText>1</w:delText>
+        </w:r>
+        <w:r>
+          <w:delText>6</w:delText>
+        </w:r>
+      </w:del>
+      <w:r>
+        <w:t xml:space="preserve">.0, then </w:t>
+      </w:r>
+      <w:r>
+        <w:t>run</w:t>
+      </w:r>
+    </w:p>
+    <w:p>
+      <w:pPr>
+        <w:ind w:left="216"/>
+      </w:pPr>
+    </w:p>
+    <w:p>
+      <w:pPr>
+        <w:ind w:left="216"/>
+        <w:jc w:val="left"/>
+        <w:rPr>
+          <w:rFonts w:ascii="Courier" w:hAnsi="Courier"/>
+          <w:sz w:val="22"/>
+          <w:szCs w:val="22"/>
+        </w:rPr>
+      </w:pPr>
+      <w:r>
+        <w:rPr>
+          <w:rFonts w:ascii="Courier" w:hAnsi="Courier"/>
+          <w:sz w:val="22"/>
+          <w:szCs w:val="22"/>
+        </w:rPr>
+        <w:t>java –</w:t>
+      </w:r>
+      <w:proofErr w:type="spellStart"/>
+      <w:r>
+        <w:rPr>
+          <w:rFonts w:ascii="Courier" w:hAnsi="Courier"/>
+          <w:sz w:val="22"/>
+          <w:szCs w:val="22"/>
+        </w:rPr>
+        <w:t>Xdebug</w:t>
+      </w:r>
+      <w:proofErr w:type="spellEnd"/>
+      <w:r>
+        <w:rPr>
+          <w:rFonts w:ascii="Courier" w:hAnsi="Courier"/>
+          <w:sz w:val="22"/>
+          <w:szCs w:val="22"/>
+        </w:rPr>
+        <w:t xml:space="preserve"> –</w:t>
+      </w:r>
+      <w:proofErr w:type="spellStart"/>
+      <w:r>
+        <w:rPr>
+          <w:rFonts w:ascii="Courier" w:hAnsi="Courier"/>
+          <w:sz w:val="22"/>
+          <w:szCs w:val="22"/>
+        </w:rPr>
+        <w:t>Xrunjdwp:server</w:t>
+      </w:r>
+      <w:proofErr w:type="spellEnd"/>
+      <w:r>
+        <w:rPr>
+          <w:rFonts w:ascii="Courier" w:hAnsi="Courier"/>
+          <w:sz w:val="22"/>
+          <w:szCs w:val="22"/>
+        </w:rPr>
+        <w:t>=y, transport=</w:t>
+      </w:r>
+      <w:proofErr w:type="spellStart"/>
+      <w:r>
+        <w:rPr>
+          <w:rFonts w:ascii="Courier" w:hAnsi="Courier"/>
+          <w:sz w:val="22"/>
+          <w:szCs w:val="22"/>
+        </w:rPr>
+        <w:t>dt_socket,suspend</w:t>
+      </w:r>
+      <w:proofErr w:type="spellEnd"/>
+      <w:r>
+        <w:rPr>
+          <w:rFonts w:ascii="Courier" w:hAnsi="Courier"/>
+          <w:sz w:val="22"/>
+          <w:szCs w:val="22"/>
+        </w:rPr>
+        <w:t>=</w:t>
+      </w:r>
+      <w:proofErr w:type="spellStart"/>
+      <w:r>
+        <w:rPr>
+          <w:rFonts w:ascii="Courier" w:hAnsi="Courier"/>
+          <w:sz w:val="22"/>
+          <w:szCs w:val="22"/>
+        </w:rPr>
+        <w:t>n,address</w:t>
+      </w:r>
+      <w:proofErr w:type="spellEnd"/>
+      <w:r>
+        <w:rPr>
+          <w:rFonts w:ascii="Courier" w:hAnsi="Courier"/>
+          <w:sz w:val="22"/>
+          <w:szCs w:val="22"/>
+        </w:rPr>
+        <w:t>=5015 –jar target/hpc-web</w:t>
+      </w:r>
+      <w:r>
+        <w:rPr>
+          <w:rFonts w:ascii="Courier" w:hAnsi="Courier"/>
+          <w:sz w:val="22"/>
+          <w:szCs w:val="22"/>
+        </w:rPr>
+        <w:t>-</w:t>
+      </w:r>
+      <w:ins w:id="83" w:author="Menon, Sunita (NIH/NCI) [C]" w:date="2021-06-13T23:49:00Z">
         <w:r>
           <w:rPr>
             <w:rFonts w:ascii="Courier" w:hAnsi="Courier"/>
             <w:sz w:val="22"/>
             <w:szCs w:val="22"/>
           </w:rPr>
-          <w:delText>1</w:delText>
-        </w:r>
-      </w:del>
-      <w:r>
-        <w:rPr>
-          <w:rFonts w:ascii="Courier" w:hAnsi="Courier"/>
-          <w:sz w:val="22"/>
-          <w:szCs w:val="22"/>
-        </w:rPr>
-        <w:t>.</w:t>
-      </w:r>
-      <w:ins w:id="63" w:author="Menon, Sunita (NIH/NCI) [C]" w:date="2021-06-13T23:49:00Z">
+          <w:t>2</w:t>
+        </w:r>
+      </w:ins>
+      <w:del w:id="84" w:author="Menon, Sunita (NIH/NCI) [C]" w:date="2021-06-13T23:49:00Z">
         <w:r>
           <w:rPr>
             <w:rFonts w:ascii="Courier" w:hAnsi="Courier"/>
             <w:sz w:val="22"/>
             <w:szCs w:val="22"/>
           </w:rPr>
+          <w:delText>1</w:delText>
+        </w:r>
+      </w:del>
+      <w:r>
+        <w:rPr>
+          <w:rFonts w:ascii="Courier" w:hAnsi="Courier"/>
+          <w:sz w:val="22"/>
+          <w:szCs w:val="22"/>
+        </w:rPr>
+        <w:t>.</w:t>
+      </w:r>
+      <w:ins w:id="85" w:author="Menon, Sunita (NIH/NCI) [C]" w:date="2021-06-13T23:49:00Z">
+        <w:r>
+          <w:rPr>
+            <w:rFonts w:ascii="Courier" w:hAnsi="Courier"/>
+            <w:sz w:val="22"/>
+            <w:szCs w:val="22"/>
+          </w:rPr>
           <w:t>8</w:t>
         </w:r>
       </w:ins>
-      <w:del w:id="64" w:author="Menon, Sunita (NIH/NCI) [C]" w:date="2021-06-13T23:49:00Z">
+      <w:del w:id="86" w:author="Menon, Sunita (NIH/NCI) [C]" w:date="2021-06-13T23:49:00Z">
         <w:r>
           <w:rPr>
             <w:rFonts w:ascii="Courier" w:hAnsi="Courier"/>
@@ -5746,7 +6003,7 @@
       <w:pPr>
         <w:pStyle w:val="Heading1"/>
       </w:pPr>
-      <w:bookmarkStart w:id="65" w:name="_Toc505280682"/>
+      <w:bookmarkStart w:id="87" w:name="_Toc505280682"/>
       <w:r>
         <w:t xml:space="preserve">HPCDME </w:t>
       </w:r>
@@ -5756,7 +6013,7 @@
       <w:r>
         <w:t>CLI Client</w:t>
       </w:r>
-      <w:bookmarkEnd w:id="65"/>
+      <w:bookmarkEnd w:id="87"/>
     </w:p>
     <w:p>
       <w:pPr>
@@ -6366,9 +6623,19 @@
           <w:sz w:val="22"/>
           <w:szCs w:val="22"/>
         </w:rPr>
-        <w:t>/&lt;</w:t>
+        <w:t>/</w:t>
       </w:r>
       <w:proofErr w:type="spellStart"/>
+      <w:del w:id="88" w:author="Menon, Sunita (NIH/NCI) [C]" w:date="2021-06-14T00:10:00Z">
+        <w:r>
+          <w:rPr>
+            <w:rFonts w:ascii="Courier" w:hAnsi="Courier"/>
+            <w:sz w:val="22"/>
+            <w:szCs w:val="22"/>
+          </w:rPr>
+          <w:delText>&lt;</w:delText>
+        </w:r>
+      </w:del>
       <w:r>
         <w:rPr>
           <w:rFonts w:ascii="Courier" w:hAnsi="Courier"/>
@@ -6443,12 +6710,12 @@
       <w:r>
         <w:t xml:space="preserve"> if the version number is </w:t>
       </w:r>
-      <w:ins w:id="66" w:author="Menon, Sunita (NIH/NCI) [C]" w:date="2021-06-13T23:50:00Z">
+      <w:ins w:id="89" w:author="Menon, Sunita (NIH/NCI) [C]" w:date="2021-06-13T23:50:00Z">
         <w:r>
           <w:t>2</w:t>
         </w:r>
       </w:ins>
-      <w:del w:id="67" w:author="Menon, Sunita (NIH/NCI) [C]" w:date="2021-06-13T23:50:00Z">
+      <w:del w:id="90" w:author="Menon, Sunita (NIH/NCI) [C]" w:date="2021-06-13T23:50:00Z">
         <w:r>
           <w:delText>1</w:delText>
         </w:r>
@@ -6456,12 +6723,12 @@
       <w:r>
         <w:t>.</w:t>
       </w:r>
-      <w:ins w:id="68" w:author="Menon, Sunita (NIH/NCI) [C]" w:date="2021-06-13T23:50:00Z">
+      <w:ins w:id="91" w:author="Menon, Sunita (NIH/NCI) [C]" w:date="2021-06-13T23:50:00Z">
         <w:r>
           <w:t>8</w:t>
         </w:r>
       </w:ins>
-      <w:del w:id="69" w:author="Menon, Sunita (NIH/NCI) [C]" w:date="2021-06-13T23:50:00Z">
+      <w:del w:id="92" w:author="Menon, Sunita (NIH/NCI) [C]" w:date="2021-06-13T23:50:00Z">
         <w:r>
           <w:delText>1</w:delText>
         </w:r>
@@ -6636,7 +6903,7 @@
         </w:rPr>
         <w:t>-client/hpc-cli-</w:t>
       </w:r>
-      <w:ins w:id="70" w:author="Menon, Sunita (NIH/NCI) [C]" w:date="2021-06-13T23:50:00Z">
+      <w:ins w:id="93" w:author="Menon, Sunita (NIH/NCI) [C]" w:date="2021-06-13T23:50:00Z">
         <w:r>
           <w:rPr>
             <w:rFonts w:ascii="Courier" w:hAnsi="Courier"/>
@@ -6646,7 +6913,7 @@
           <w:t>2</w:t>
         </w:r>
       </w:ins>
-      <w:del w:id="71" w:author="Menon, Sunita (NIH/NCI) [C]" w:date="2021-06-13T23:50:00Z">
+      <w:del w:id="94" w:author="Menon, Sunita (NIH/NCI) [C]" w:date="2021-06-13T23:50:00Z">
         <w:r>
           <w:rPr>
             <w:rFonts w:ascii="Courier" w:hAnsi="Courier"/>
@@ -6664,7 +6931,7 @@
         </w:rPr>
         <w:t>.</w:t>
       </w:r>
-      <w:ins w:id="72" w:author="Menon, Sunita (NIH/NCI) [C]" w:date="2021-06-13T23:50:00Z">
+      <w:ins w:id="95" w:author="Menon, Sunita (NIH/NCI) [C]" w:date="2021-06-13T23:50:00Z">
         <w:r>
           <w:rPr>
             <w:rFonts w:ascii="Courier" w:hAnsi="Courier"/>
@@ -6674,7 +6941,7 @@
           <w:t>8</w:t>
         </w:r>
       </w:ins>
-      <w:del w:id="73" w:author="Menon, Sunita (NIH/NCI) [C]" w:date="2021-06-13T23:50:00Z">
+      <w:del w:id="96" w:author="Menon, Sunita (NIH/NCI) [C]" w:date="2021-06-13T23:50:00Z">
         <w:r>
           <w:rPr>
             <w:rFonts w:ascii="Courier" w:hAnsi="Courier"/>
@@ -6825,11 +7092,11 @@
       <w:pPr>
         <w:pStyle w:val="Heading1"/>
       </w:pPr>
-      <w:bookmarkStart w:id="74" w:name="_Toc505280683"/>
+      <w:bookmarkStart w:id="97" w:name="_Toc505280683"/>
       <w:r>
         <w:t>Eclipse</w:t>
       </w:r>
-      <w:bookmarkEnd w:id="74"/>
+      <w:bookmarkEnd w:id="97"/>
     </w:p>
     <w:p>
       <w:pPr>

</xml_diff>

<commit_message>
Add minor changes to the ServiceMix section
</commit_message>
<xml_diff>
--- a/doc/development/HPC Development Environment Setup.docx
+++ b/doc/development/HPC Development Environment Setup.docx
@@ -2739,8 +2739,13 @@
       <w:pPr>
         <w:ind w:left="216"/>
       </w:pPr>
-      <w:r>
-        <w:t>Set  SERVICE_MIX_HOME environment variable accordingly</w:t>
+      <w:proofErr w:type="gramStart"/>
+      <w:r>
+        <w:t>Set  SERVICE</w:t>
+      </w:r>
+      <w:proofErr w:type="gramEnd"/>
+      <w:r>
+        <w:t>_MIX_HOME environment variable accordingly</w:t>
       </w:r>
       <w:r>
         <w:t>.</w:t>
@@ -2951,6 +2956,7 @@
         <w:tab/>
       </w:r>
       <w:proofErr w:type="spellStart"/>
+      <w:proofErr w:type="gramStart"/>
       <w:r>
         <w:rPr>
           <w:rFonts w:ascii="Courier" w:hAnsi="Courier"/>
@@ -2961,6 +2967,7 @@
         <w:t>javax.net.ssl.keyStore</w:t>
       </w:r>
       <w:proofErr w:type="spellEnd"/>
+      <w:proofErr w:type="gramEnd"/>
       <w:r>
         <w:rPr>
           <w:rFonts w:ascii="Courier" w:hAnsi="Courier"/>
@@ -3068,6 +3075,7 @@
         </w:rPr>
       </w:pPr>
       <w:proofErr w:type="spellStart"/>
+      <w:proofErr w:type="gramStart"/>
       <w:r>
         <w:rPr>
           <w:rFonts w:ascii="Courier" w:hAnsi="Courier"/>
@@ -3078,6 +3086,7 @@
         <w:t>javax.net.ssl.keyStorePassword</w:t>
       </w:r>
       <w:proofErr w:type="spellEnd"/>
+      <w:proofErr w:type="gramEnd"/>
       <w:r>
         <w:rPr>
           <w:rFonts w:ascii="Courier" w:hAnsi="Courier"/>
@@ -3115,6 +3124,7 @@
           <w:szCs w:val="22"/>
         </w:rPr>
       </w:pPr>
+      <w:proofErr w:type="gramStart"/>
       <w:r>
         <w:rPr>
           <w:rFonts w:ascii="Courier" w:hAnsi="Courier"/>
@@ -3122,7 +3132,17 @@
           <w:sz w:val="22"/>
           <w:szCs w:val="22"/>
         </w:rPr>
-        <w:t>javax.net.ssl.trustStore=${karaf.home}/etc/hpc-server/</w:t>
+        <w:t>javax.net.ssl.trustStore</w:t>
+      </w:r>
+      <w:proofErr w:type="gramEnd"/>
+      <w:r>
+        <w:rPr>
+          <w:rFonts w:ascii="Courier" w:hAnsi="Courier"/>
+          <w:color w:val="000000"/>
+          <w:sz w:val="22"/>
+          <w:szCs w:val="22"/>
+        </w:rPr>
+        <w:t>=${karaf.home}/etc/hpc-server/</w:t>
       </w:r>
       <w:r>
         <w:rPr>
@@ -3157,6 +3177,7 @@
         </w:rPr>
       </w:pPr>
       <w:proofErr w:type="spellStart"/>
+      <w:proofErr w:type="gramStart"/>
       <w:r>
         <w:rPr>
           <w:rFonts w:ascii="Courier" w:hAnsi="Courier"/>
@@ -3168,6 +3189,7 @@
         <w:t>javax.net.ssl.trustStorePassword</w:t>
       </w:r>
       <w:proofErr w:type="spellEnd"/>
+      <w:proofErr w:type="gramEnd"/>
       <w:r>
         <w:rPr>
           <w:rFonts w:ascii="Courier" w:hAnsi="Courier"/>
@@ -3303,8 +3325,13 @@
         <w:t xml:space="preserve">Set the </w:t>
       </w:r>
       <w:proofErr w:type="spellStart"/>
-      <w:r>
-        <w:t>hpc.bus.aspect.systemAdministratorUserId</w:t>
+      <w:proofErr w:type="gramStart"/>
+      <w:r>
+        <w:t>hpc.bus.aspect</w:t>
+      </w:r>
+      <w:proofErr w:type="gramEnd"/>
+      <w:r>
+        <w:t>.systemAdministratorUserId</w:t>
       </w:r>
       <w:proofErr w:type="spellEnd"/>
       <w:r>
@@ -3354,8 +3381,13 @@
         <w:t xml:space="preserve">Set the </w:t>
       </w:r>
       <w:proofErr w:type="spellStart"/>
-      <w:r>
-        <w:t>hpc.integration.ldap.password</w:t>
+      <w:proofErr w:type="gramStart"/>
+      <w:r>
+        <w:t>hpc.integration</w:t>
+      </w:r>
+      <w:proofErr w:type="gramEnd"/>
+      <w:r>
+        <w:t>.ldap.password</w:t>
       </w:r>
       <w:proofErr w:type="spellEnd"/>
       <w:del w:id="20" w:author="Menon, Sunita (NIH/NCI) [C]" w:date="2021-06-13T23:53:00Z">
@@ -3402,6 +3434,7 @@
         <w:t xml:space="preserve"> </w:t>
       </w:r>
       <w:proofErr w:type="spellStart"/>
+      <w:proofErr w:type="gramStart"/>
       <w:r>
         <w:t>hpc.dao.</w:t>
       </w:r>
@@ -3410,6 +3443,7 @@
           <w:t>oracle</w:t>
         </w:r>
       </w:ins>
+      <w:proofErr w:type="gramEnd"/>
       <w:del w:id="22" w:author="Menon, Sunita (NIH/NCI) [C]" w:date="2021-06-13T23:52:00Z">
         <w:r>
           <w:delText>postgresql</w:delText>
@@ -3672,12 +3706,6 @@
           <w:rPr>
             <w:b/>
             <w:bCs/>
-            <w:rPrChange w:id="33" w:author="Menon, Sunita (NIH/NCI) [C]" w:date="2021-06-13T23:47:00Z">
-              <w:rPr>
-                <w:b/>
-                <w:bCs/>
-              </w:rPr>
-            </w:rPrChange>
           </w:rPr>
           <w:t>hpc</w:t>
         </w:r>
@@ -3686,12 +3714,6 @@
           <w:rPr>
             <w:b/>
             <w:bCs/>
-            <w:rPrChange w:id="34" w:author="Menon, Sunita (NIH/NCI) [C]" w:date="2021-06-13T23:47:00Z">
-              <w:rPr>
-                <w:b/>
-                <w:bCs/>
-              </w:rPr>
-            </w:rPrChange>
           </w:rPr>
           <w:t>-server-</w:t>
         </w:r>
@@ -3700,23 +3722,17 @@
           <w:rPr>
             <w:b/>
             <w:bCs/>
-            <w:rPrChange w:id="35" w:author="Menon, Sunita (NIH/NCI) [C]" w:date="2021-06-13T23:47:00Z">
-              <w:rPr>
-                <w:b/>
-                <w:bCs/>
-              </w:rPr>
-            </w:rPrChange>
           </w:rPr>
           <w:t>local.properties</w:t>
         </w:r>
       </w:ins>
       <w:proofErr w:type="spellEnd"/>
-      <w:ins w:id="36" w:author="Menon, Sunita (NIH/NCI) [C]" w:date="2021-06-13T23:47:00Z">
+      <w:ins w:id="33" w:author="Menon, Sunita (NIH/NCI) [C]" w:date="2021-06-13T23:47:00Z">
         <w:r>
           <w:t xml:space="preserve"> is </w:t>
         </w:r>
       </w:ins>
-      <w:del w:id="37" w:author="Menon, Sunita (NIH/NCI) [C]" w:date="2021-06-13T23:45:00Z">
+      <w:del w:id="34" w:author="Menon, Sunita (NIH/NCI) [C]" w:date="2021-06-13T23:45:00Z">
         <w:r>
           <w:rPr>
             <w:b/>
@@ -3728,7 +3744,7 @@
           <w:delText>: Skip this step if you are setting up your local development environment, since y</w:delText>
         </w:r>
       </w:del>
-      <w:del w:id="38" w:author="Menon, Sunita (NIH/NCI) [C]" w:date="2021-06-13T23:47:00Z">
+      <w:del w:id="35" w:author="Menon, Sunita (NIH/NCI) [C]" w:date="2021-06-13T23:47:00Z">
         <w:r>
           <w:delText xml:space="preserve">ou will be </w:delText>
         </w:r>
@@ -3736,7 +3752,7 @@
       <w:r>
         <w:t>pointing to the already installed Dev. Environment Instance</w:t>
       </w:r>
-      <w:del w:id="39" w:author="Menon, Sunita (NIH/NCI) [C]" w:date="2021-06-13T23:48:00Z">
+      <w:del w:id="36" w:author="Menon, Sunita (NIH/NCI) [C]" w:date="2021-06-13T23:48:00Z">
         <w:r>
           <w:delText xml:space="preserve"> in </w:delText>
         </w:r>
@@ -3755,7 +3771,7 @@
       <w:pPr>
         <w:ind w:left="216"/>
         <w:rPr>
-          <w:del w:id="40" w:author="Menon, Sunita (NIH/NCI) [C]" w:date="2021-06-13T23:46:00Z"/>
+          <w:del w:id="37" w:author="Menon, Sunita (NIH/NCI) [C]" w:date="2021-06-13T23:46:00Z"/>
         </w:rPr>
       </w:pPr>
     </w:p>
@@ -3763,10 +3779,10 @@
       <w:pPr>
         <w:ind w:left="216"/>
         <w:rPr>
-          <w:del w:id="41" w:author="Menon, Sunita (NIH/NCI) [C]" w:date="2021-06-13T23:46:00Z"/>
-        </w:rPr>
-      </w:pPr>
-      <w:del w:id="42" w:author="Menon, Sunita (NIH/NCI) [C]" w:date="2021-06-13T23:46:00Z">
+          <w:del w:id="38" w:author="Menon, Sunita (NIH/NCI) [C]" w:date="2021-06-13T23:46:00Z"/>
+        </w:rPr>
+      </w:pPr>
+      <w:del w:id="39" w:author="Menon, Sunita (NIH/NCI) [C]" w:date="2021-06-13T23:46:00Z">
         <w:r>
           <w:delText>Install</w:delText>
         </w:r>
@@ -3808,10 +3824,10 @@
         </w:numPr>
         <w:jc w:val="left"/>
         <w:rPr>
-          <w:del w:id="43" w:author="Menon, Sunita (NIH/NCI) [C]" w:date="2021-06-13T23:46:00Z"/>
-        </w:rPr>
-      </w:pPr>
-      <w:del w:id="44" w:author="Menon, Sunita (NIH/NCI) [C]" w:date="2021-06-13T23:46:00Z">
+          <w:del w:id="40" w:author="Menon, Sunita (NIH/NCI) [C]" w:date="2021-06-13T23:46:00Z"/>
+        </w:rPr>
+      </w:pPr>
+      <w:del w:id="41" w:author="Menon, Sunita (NIH/NCI) [C]" w:date="2021-06-13T23:46:00Z">
         <w:r>
           <w:delText>Execute a</w:delText>
         </w:r>
@@ -3844,10 +3860,10 @@
         </w:numPr>
         <w:jc w:val="left"/>
         <w:rPr>
-          <w:del w:id="45" w:author="Menon, Sunita (NIH/NCI) [C]" w:date="2021-06-13T23:46:00Z"/>
-        </w:rPr>
-      </w:pPr>
-      <w:del w:id="46" w:author="Menon, Sunita (NIH/NCI) [C]" w:date="2021-06-13T23:46:00Z">
+          <w:del w:id="42" w:author="Menon, Sunita (NIH/NCI) [C]" w:date="2021-06-13T23:46:00Z"/>
+        </w:rPr>
+      </w:pPr>
+      <w:del w:id="43" w:author="Menon, Sunita (NIH/NCI) [C]" w:date="2021-06-13T23:46:00Z">
         <w:r>
           <w:rPr>
             <w:color w:val="3B2322"/>
@@ -3871,10 +3887,10 @@
         </w:numPr>
         <w:jc w:val="left"/>
         <w:rPr>
-          <w:del w:id="47" w:author="Menon, Sunita (NIH/NCI) [C]" w:date="2021-06-13T23:46:00Z"/>
-        </w:rPr>
-      </w:pPr>
-      <w:del w:id="48" w:author="Menon, Sunita (NIH/NCI) [C]" w:date="2021-06-13T23:46:00Z">
+          <w:del w:id="44" w:author="Menon, Sunita (NIH/NCI) [C]" w:date="2021-06-13T23:46:00Z"/>
+        </w:rPr>
+      </w:pPr>
+      <w:del w:id="45" w:author="Menon, Sunita (NIH/NCI) [C]" w:date="2021-06-13T23:46:00Z">
         <w:r>
           <w:rPr>
             <w:color w:val="3B2322"/>
@@ -3892,10 +3908,10 @@
         </w:numPr>
         <w:jc w:val="left"/>
         <w:rPr>
-          <w:del w:id="49" w:author="Menon, Sunita (NIH/NCI) [C]" w:date="2021-06-13T23:46:00Z"/>
-        </w:rPr>
-      </w:pPr>
-      <w:del w:id="50" w:author="Menon, Sunita (NIH/NCI) [C]" w:date="2021-06-13T23:46:00Z">
+          <w:del w:id="46" w:author="Menon, Sunita (NIH/NCI) [C]" w:date="2021-06-13T23:46:00Z"/>
+        </w:rPr>
+      </w:pPr>
+      <w:del w:id="47" w:author="Menon, Sunita (NIH/NCI) [C]" w:date="2021-06-13T23:46:00Z">
         <w:r>
           <w:delText>Execute SQL scripts intended for DEV environment (they end with ‘dev’ in the script name’) in $HPC_HOME/hpc-server/hpc-dao-impl/src/main/scripts/restore.</w:delText>
         </w:r>
@@ -3910,10 +3926,10 @@
         </w:numPr>
         <w:jc w:val="left"/>
         <w:rPr>
-          <w:del w:id="51" w:author="Menon, Sunita (NIH/NCI) [C]" w:date="2021-06-13T23:46:00Z"/>
-        </w:rPr>
-      </w:pPr>
-      <w:del w:id="52" w:author="Menon, Sunita (NIH/NCI) [C]" w:date="2021-06-13T23:46:00Z">
+          <w:del w:id="48" w:author="Menon, Sunita (NIH/NCI) [C]" w:date="2021-06-13T23:46:00Z"/>
+        </w:rPr>
+      </w:pPr>
+      <w:del w:id="49" w:author="Menon, Sunita (NIH/NCI) [C]" w:date="2021-06-13T23:46:00Z">
         <w:r>
           <w:delText>Manually insert a row into HPC_USER table using your info (NIH user-id, first-name, last-name, etc)</w:delText>
         </w:r>
@@ -3928,11 +3944,11 @@
       <w:pPr>
         <w:pStyle w:val="Heading1"/>
       </w:pPr>
-      <w:bookmarkStart w:id="53" w:name="_Toc505280675"/>
+      <w:bookmarkStart w:id="50" w:name="_Toc505280675"/>
       <w:r>
         <w:t>IRODS</w:t>
       </w:r>
-      <w:bookmarkEnd w:id="53"/>
+      <w:bookmarkEnd w:id="50"/>
     </w:p>
     <w:p>
       <w:pPr>
@@ -3949,7 +3965,7 @@
       <w:r>
         <w:t xml:space="preserve"> account in the DEV environment. Ask a team member to register you as an HPC-DM user in the DEV environment.</w:t>
       </w:r>
-      <w:del w:id="54" w:author="Menon, Sunita (NIH/NCI) [C]" w:date="2021-06-14T00:21:00Z">
+      <w:del w:id="51" w:author="Menon, Sunita (NIH/NCI) [C]" w:date="2021-06-14T00:21:00Z">
         <w:r>
           <w:delText>.</w:delText>
         </w:r>
@@ -3975,14 +3991,14 @@
       <w:pPr>
         <w:pStyle w:val="Heading1"/>
       </w:pPr>
-      <w:bookmarkStart w:id="55" w:name="_Toc505280676"/>
+      <w:bookmarkStart w:id="52" w:name="_Toc505280676"/>
       <w:r>
         <w:t>PATH</w:t>
       </w:r>
       <w:r>
         <w:t xml:space="preserve"> Environment Variable</w:t>
       </w:r>
-      <w:bookmarkEnd w:id="55"/>
+      <w:bookmarkEnd w:id="52"/>
     </w:p>
     <w:p>
       <w:pPr>
@@ -4027,7 +4043,27 @@
           <w:sz w:val="22"/>
           <w:szCs w:val="22"/>
         </w:rPr>
-        <w:t>PATH=$MAVEN_HOME/bin:$SERVICE_MIX_HOME/bin:$PATH</w:t>
+        <w:t>PATH=$MAVEN_HOME/</w:t>
+      </w:r>
+      <w:proofErr w:type="gramStart"/>
+      <w:r>
+        <w:rPr>
+          <w:rFonts w:ascii="Courier" w:hAnsi="Courier" w:cs="Courier"/>
+          <w:color w:val="3B2322"/>
+          <w:sz w:val="22"/>
+          <w:szCs w:val="22"/>
+        </w:rPr>
+        <w:t>bin:$</w:t>
+      </w:r>
+      <w:proofErr w:type="gramEnd"/>
+      <w:r>
+        <w:rPr>
+          <w:rFonts w:ascii="Courier" w:hAnsi="Courier" w:cs="Courier"/>
+          <w:color w:val="3B2322"/>
+          <w:sz w:val="22"/>
+          <w:szCs w:val="22"/>
+        </w:rPr>
+        <w:t>SERVICE_MIX_HOME/bin:$PATH</w:t>
       </w:r>
     </w:p>
     <w:p>
@@ -4039,11 +4075,11 @@
       <w:pPr>
         <w:pStyle w:val="Heading1"/>
       </w:pPr>
-      <w:bookmarkStart w:id="56" w:name="_Toc505280677"/>
+      <w:bookmarkStart w:id="53" w:name="_Toc505280677"/>
       <w:r>
         <w:t>BUILD</w:t>
       </w:r>
-      <w:bookmarkEnd w:id="56"/>
+      <w:bookmarkEnd w:id="53"/>
     </w:p>
     <w:p>
       <w:pPr>
@@ -4156,27 +4192,27 @@
       <w:r>
         <w:t xml:space="preserve"> HPC DME software products.  This </w:t>
       </w:r>
-      <w:ins w:id="57" w:author="Menon, Sunita (NIH/NCI) [C]" w:date="2021-06-14T00:17:00Z">
+      <w:ins w:id="54" w:author="Menon, Sunita (NIH/NCI) [C]" w:date="2021-06-14T00:17:00Z">
         <w:r>
           <w:t xml:space="preserve">is required the first time you do the build. After that, </w:t>
         </w:r>
       </w:ins>
-      <w:ins w:id="58" w:author="Menon, Sunita (NIH/NCI) [C]" w:date="2021-06-14T00:19:00Z">
+      <w:ins w:id="55" w:author="Menon, Sunita (NIH/NCI) [C]" w:date="2021-06-14T00:19:00Z">
         <w:r>
           <w:t xml:space="preserve">if you wish, </w:t>
         </w:r>
       </w:ins>
-      <w:ins w:id="59" w:author="Menon, Sunita (NIH/NCI) [C]" w:date="2021-06-14T00:18:00Z">
+      <w:ins w:id="56" w:author="Menon, Sunita (NIH/NCI) [C]" w:date="2021-06-14T00:18:00Z">
         <w:r>
           <w:t>you can exclude the modules you do not need</w:t>
         </w:r>
       </w:ins>
-      <w:ins w:id="60" w:author="Menon, Sunita (NIH/NCI) [C]" w:date="2021-06-14T00:19:00Z">
+      <w:ins w:id="57" w:author="Menon, Sunita (NIH/NCI) [C]" w:date="2021-06-14T00:19:00Z">
         <w:r>
           <w:t xml:space="preserve"> to save build time</w:t>
         </w:r>
       </w:ins>
-      <w:del w:id="61" w:author="Menon, Sunita (NIH/NCI) [C]" w:date="2021-06-14T00:19:00Z">
+      <w:del w:id="58" w:author="Menon, Sunita (NIH/NCI) [C]" w:date="2021-06-14T00:19:00Z">
         <w:r>
           <w:delText xml:space="preserve">could be </w:delText>
         </w:r>
@@ -4277,82 +4313,82 @@
           <w:b/>
           <w:bCs/>
         </w:rPr>
-        <w:t>-pl “!</w:t>
-      </w:r>
-      <w:proofErr w:type="spellStart"/>
+        <w:t xml:space="preserve">-pl </w:t>
+      </w:r>
+      <w:proofErr w:type="gramStart"/>
       <w:r>
         <w:rPr>
           <w:b/>
           <w:bCs/>
         </w:rPr>
-        <w:t>hpc</w:t>
-      </w:r>
-      <w:proofErr w:type="spellEnd"/>
+        <w:t>“!</w:t>
+      </w:r>
+      <w:proofErr w:type="spellStart"/>
       <w:r>
         <w:rPr>
           <w:b/>
           <w:bCs/>
         </w:rPr>
-        <w:t>-server/</w:t>
-      </w:r>
-      <w:proofErr w:type="spellStart"/>
+        <w:t>hpc</w:t>
+      </w:r>
+      <w:proofErr w:type="spellEnd"/>
+      <w:proofErr w:type="gramEnd"/>
       <w:r>
         <w:rPr>
           <w:b/>
           <w:bCs/>
         </w:rPr>
-        <w:t>hpc</w:t>
-      </w:r>
-      <w:proofErr w:type="spellEnd"/>
+        <w:t>-server/</w:t>
+      </w:r>
+      <w:proofErr w:type="spellStart"/>
       <w:r>
         <w:rPr>
           <w:b/>
           <w:bCs/>
         </w:rPr>
-        <w:t>-</w:t>
-      </w:r>
-      <w:proofErr w:type="spellStart"/>
+        <w:t>hpc</w:t>
+      </w:r>
+      <w:proofErr w:type="spellEnd"/>
       <w:r>
         <w:rPr>
           <w:b/>
           <w:bCs/>
         </w:rPr>
-        <w:t>ws</w:t>
-      </w:r>
-      <w:proofErr w:type="spellEnd"/>
+        <w:t>-</w:t>
+      </w:r>
+      <w:proofErr w:type="spellStart"/>
       <w:r>
         <w:rPr>
           <w:b/>
           <w:bCs/>
         </w:rPr>
-        <w:t>-</w:t>
-      </w:r>
-      <w:proofErr w:type="spellStart"/>
+        <w:t>ws</w:t>
+      </w:r>
+      <w:proofErr w:type="spellEnd"/>
       <w:r>
         <w:rPr>
           <w:b/>
           <w:bCs/>
         </w:rPr>
-        <w:t>rs</w:t>
-      </w:r>
-      <w:proofErr w:type="spellEnd"/>
+        <w:t>-</w:t>
+      </w:r>
+      <w:proofErr w:type="spellStart"/>
       <w:r>
         <w:rPr>
           <w:b/>
           <w:bCs/>
         </w:rPr>
-        <w:t>-</w:t>
-      </w:r>
-      <w:proofErr w:type="gramStart"/>
+        <w:t>rs</w:t>
+      </w:r>
+      <w:proofErr w:type="spellEnd"/>
       <w:r>
         <w:rPr>
           <w:b/>
           <w:bCs/>
         </w:rPr>
-        <w:t>test,!</w:t>
+        <w:t>-test,!</w:t>
       </w:r>
       <w:proofErr w:type="spellStart"/>
-      <w:proofErr w:type="gramEnd"/>
       <w:r>
         <w:rPr>
           <w:b/>
@@ -4424,6 +4460,7 @@
       <w:r>
         <w:t xml:space="preserve"> </w:t>
       </w:r>
+      <w:proofErr w:type="gramStart"/>
       <w:r>
         <w:rPr>
           <w:b/>
@@ -4440,6 +4477,7 @@
         <w:t>hpc</w:t>
       </w:r>
       <w:proofErr w:type="spellEnd"/>
+      <w:proofErr w:type="gramEnd"/>
       <w:r>
         <w:rPr>
           <w:b/>
@@ -4493,287 +4531,294 @@
           <w:b/>
           <w:bCs/>
         </w:rPr>
-        <w:t>-</w:t>
-      </w:r>
-      <w:proofErr w:type="gramStart"/>
+        <w:t>-test,!</w:t>
+      </w:r>
+      <w:proofErr w:type="spellStart"/>
       <w:r>
         <w:rPr>
           <w:b/>
           <w:bCs/>
         </w:rPr>
-        <w:t>test,!</w:t>
-      </w:r>
-      <w:proofErr w:type="spellStart"/>
-      <w:proofErr w:type="gramEnd"/>
+        <w:t>hpc</w:t>
+      </w:r>
+      <w:proofErr w:type="spellEnd"/>
       <w:r>
         <w:rPr>
           <w:b/>
           <w:bCs/>
         </w:rPr>
-        <w:t>hpc</w:t>
-      </w:r>
-      <w:proofErr w:type="spellEnd"/>
+        <w:t>-cli’</w:t>
+      </w:r>
+      <w:r>
+        <w:t xml:space="preserve"> clean install</w:t>
+      </w:r>
+    </w:p>
+    <w:p>
+      <w:pPr>
+        <w:ind w:left="216"/>
+      </w:pPr>
+    </w:p>
+    <w:p>
+      <w:pPr>
+        <w:ind w:left="216"/>
+      </w:pPr>
+      <w:r>
+        <w:t xml:space="preserve">With the -pl option, </w:t>
+      </w:r>
+      <w:r>
+        <w:t xml:space="preserve">you can indicate which modules to skip by specifying </w:t>
+      </w:r>
+      <w:r>
+        <w:t xml:space="preserve">a </w:t>
+      </w:r>
+      <w:r>
+        <w:t xml:space="preserve">comma-separated list of module specifications each prefixed </w:t>
+      </w:r>
+      <w:proofErr w:type="gramStart"/>
+      <w:r>
+        <w:t>with !</w:t>
+      </w:r>
+      <w:proofErr w:type="gramEnd"/>
+      <w:r>
+        <w:t xml:space="preserve">.  In the above examples, the </w:t>
+      </w:r>
+      <w:proofErr w:type="spellStart"/>
       <w:r>
         <w:rPr>
           <w:b/>
           <w:bCs/>
         </w:rPr>
-        <w:t>-cli’</w:t>
-      </w:r>
-      <w:r>
-        <w:t xml:space="preserve"> clean install</w:t>
-      </w:r>
-    </w:p>
-    <w:p>
-      <w:pPr>
-        <w:ind w:left="216"/>
-      </w:pPr>
-    </w:p>
-    <w:p>
-      <w:pPr>
-        <w:ind w:left="216"/>
-      </w:pPr>
-      <w:r>
-        <w:t xml:space="preserve">With the -pl option, </w:t>
-      </w:r>
-      <w:r>
-        <w:t xml:space="preserve">you can indicate which modules to skip by specifying </w:t>
-      </w:r>
-      <w:r>
-        <w:t xml:space="preserve">a </w:t>
-      </w:r>
-      <w:r>
-        <w:t xml:space="preserve">comma-separated list of module specifications each prefixed with !.  In the above examples, the </w:t>
-      </w:r>
-      <w:proofErr w:type="spellStart"/>
+        <w:t>hpc</w:t>
+      </w:r>
+      <w:proofErr w:type="spellEnd"/>
       <w:r>
         <w:rPr>
           <w:b/>
           <w:bCs/>
         </w:rPr>
-        <w:t>hpc</w:t>
-      </w:r>
-      <w:proofErr w:type="spellEnd"/>
+        <w:t>-</w:t>
+      </w:r>
+      <w:proofErr w:type="spellStart"/>
       <w:r>
         <w:rPr>
           <w:b/>
           <w:bCs/>
         </w:rPr>
-        <w:t>-</w:t>
-      </w:r>
-      <w:proofErr w:type="spellStart"/>
+        <w:t>ws</w:t>
+      </w:r>
+      <w:proofErr w:type="spellEnd"/>
       <w:r>
         <w:rPr>
           <w:b/>
           <w:bCs/>
         </w:rPr>
-        <w:t>ws</w:t>
-      </w:r>
-      <w:proofErr w:type="spellEnd"/>
+        <w:t>-</w:t>
+      </w:r>
+      <w:proofErr w:type="spellStart"/>
       <w:r>
         <w:rPr>
           <w:b/>
           <w:bCs/>
         </w:rPr>
-        <w:t>-</w:t>
-      </w:r>
-      <w:proofErr w:type="spellStart"/>
+        <w:t>rs</w:t>
+      </w:r>
+      <w:proofErr w:type="spellEnd"/>
       <w:r>
         <w:rPr>
           <w:b/>
           <w:bCs/>
         </w:rPr>
-        <w:t>rs</w:t>
-      </w:r>
-      <w:proofErr w:type="spellEnd"/>
+        <w:t>-test</w:t>
+      </w:r>
+      <w:r>
+        <w:t xml:space="preserve"> module of the </w:t>
+      </w:r>
+      <w:proofErr w:type="spellStart"/>
       <w:r>
         <w:rPr>
           <w:b/>
           <w:bCs/>
         </w:rPr>
-        <w:t>-test</w:t>
-      </w:r>
-      <w:r>
-        <w:t xml:space="preserve"> module of the </w:t>
-      </w:r>
-      <w:proofErr w:type="spellStart"/>
+        <w:t>hpc</w:t>
+      </w:r>
+      <w:proofErr w:type="spellEnd"/>
       <w:r>
         <w:rPr>
           <w:b/>
           <w:bCs/>
         </w:rPr>
-        <w:t>hpc</w:t>
-      </w:r>
-      <w:proofErr w:type="spellEnd"/>
+        <w:t>-server</w:t>
+      </w:r>
+      <w:r>
+        <w:t xml:space="preserve"> module and the </w:t>
+      </w:r>
+      <w:proofErr w:type="spellStart"/>
       <w:r>
         <w:rPr>
           <w:b/>
           <w:bCs/>
         </w:rPr>
-        <w:t>-server</w:t>
-      </w:r>
-      <w:r>
-        <w:t xml:space="preserve"> module and the </w:t>
-      </w:r>
-      <w:proofErr w:type="spellStart"/>
+        <w:t>hpc</w:t>
+      </w:r>
+      <w:proofErr w:type="spellEnd"/>
       <w:r>
         <w:rPr>
           <w:b/>
           <w:bCs/>
         </w:rPr>
-        <w:t>hpc</w:t>
+        <w:t>-cli</w:t>
+      </w:r>
+      <w:r>
+        <w:t xml:space="preserve"> module are declared to be skipped.</w:t>
+      </w:r>
+    </w:p>
+    <w:p>
+      <w:pPr>
+        <w:ind w:left="216"/>
+      </w:pPr>
+    </w:p>
+    <w:p>
+      <w:pPr>
+        <w:ind w:left="216"/>
+      </w:pPr>
+      <w:r>
+        <w:t xml:space="preserve">The </w:t>
+      </w:r>
+      <w:r>
+        <w:t xml:space="preserve">preceding </w:t>
+      </w:r>
+      <w:r>
+        <w:t xml:space="preserve">examples assume you want to build all modules except for specific exclusion(s).  If instead you want to build specific module(s) and exclude the rest, you can use the -pl option to specify comma-separated list of modules you wish to build.  In that case, each module is declared without </w:t>
+      </w:r>
+      <w:proofErr w:type="gramStart"/>
+      <w:r>
+        <w:t>the !</w:t>
+      </w:r>
+      <w:proofErr w:type="gramEnd"/>
+      <w:r>
+        <w:t xml:space="preserve"> prefix.</w:t>
+      </w:r>
+    </w:p>
+    <w:p>
+      <w:pPr>
+        <w:ind w:left="216"/>
+      </w:pPr>
+    </w:p>
+    <w:p>
+      <w:pPr>
+        <w:pStyle w:val="Heading1"/>
+      </w:pPr>
+      <w:bookmarkStart w:id="59" w:name="_Toc505280678"/>
+      <w:r>
+        <w:t>DEPLOY</w:t>
+      </w:r>
+      <w:r>
+        <w:t xml:space="preserve"> </w:t>
+      </w:r>
+      <w:r>
+        <w:t xml:space="preserve">API </w:t>
+      </w:r>
+      <w:r>
+        <w:t>to SERVICEMIX</w:t>
+      </w:r>
+      <w:bookmarkEnd w:id="59"/>
+    </w:p>
+    <w:p>
+      <w:pPr>
+        <w:ind w:left="216"/>
+      </w:pPr>
+      <w:r>
+        <w:t xml:space="preserve">Find the server version (from the </w:t>
+      </w:r>
+      <w:proofErr w:type="gramStart"/>
+      <w:r>
+        <w:t>top level</w:t>
+      </w:r>
+      <w:proofErr w:type="gramEnd"/>
+      <w:r>
+        <w:t xml:space="preserve"> pom file). You will need to use it in the command to start the server.</w:t>
+      </w:r>
+    </w:p>
+    <w:p>
+      <w:pPr>
+        <w:ind w:left="216"/>
+      </w:pPr>
+      <w:r>
+        <w:t xml:space="preserve">Run </w:t>
+      </w:r>
+      <w:proofErr w:type="spellStart"/>
+      <w:r>
+        <w:t>Servicemix</w:t>
       </w:r>
       <w:proofErr w:type="spellEnd"/>
+      <w:r>
+        <w:t xml:space="preserve"> console</w:t>
+      </w:r>
+      <w:r>
+        <w:t xml:space="preserve"> with the command</w:t>
+      </w:r>
+      <w:r>
+        <w:t>:</w:t>
+      </w:r>
+    </w:p>
+    <w:p>
+      <w:pPr>
+        <w:ind w:left="216"/>
+      </w:pPr>
+    </w:p>
+    <w:p>
+      <w:pPr>
+        <w:ind w:left="216"/>
+        <w:rPr>
+          <w:rFonts w:ascii="Courier" w:hAnsi="Courier"/>
+          <w:sz w:val="22"/>
+          <w:szCs w:val="22"/>
+        </w:rPr>
+      </w:pPr>
+      <w:r>
+        <w:t xml:space="preserve"> </w:t>
+      </w:r>
+      <w:proofErr w:type="spellStart"/>
+      <w:r>
+        <w:rPr>
+          <w:rFonts w:ascii="Courier" w:hAnsi="Courier"/>
+          <w:sz w:val="22"/>
+          <w:szCs w:val="22"/>
+        </w:rPr>
+        <w:t>s</w:t>
+      </w:r>
+      <w:r>
+        <w:rPr>
+          <w:rFonts w:ascii="Courier" w:hAnsi="Courier"/>
+          <w:sz w:val="22"/>
+          <w:szCs w:val="22"/>
+        </w:rPr>
+        <w:t>ervicemix</w:t>
+      </w:r>
+      <w:proofErr w:type="spellEnd"/>
+      <w:r>
+        <w:rPr>
+          <w:rFonts w:ascii="Courier" w:hAnsi="Courier"/>
+          <w:sz w:val="22"/>
+          <w:szCs w:val="22"/>
+        </w:rPr>
+        <w:t xml:space="preserve"> clean debug</w:t>
+      </w:r>
+    </w:p>
+    <w:p>
+      <w:pPr>
+        <w:ind w:left="216"/>
+      </w:pPr>
+    </w:p>
+    <w:p>
+      <w:pPr>
+        <w:ind w:left="216"/>
+      </w:pPr>
       <w:r>
         <w:rPr>
           <w:b/>
           <w:bCs/>
         </w:rPr>
-        <w:t>-cli</w:t>
-      </w:r>
-      <w:r>
-        <w:t xml:space="preserve"> module are declared to be skipped.</w:t>
-      </w:r>
-    </w:p>
-    <w:p>
-      <w:pPr>
-        <w:ind w:left="216"/>
-      </w:pPr>
-    </w:p>
-    <w:p>
-      <w:pPr>
-        <w:ind w:left="216"/>
-      </w:pPr>
-      <w:r>
-        <w:t xml:space="preserve">The </w:t>
-      </w:r>
-      <w:r>
-        <w:t xml:space="preserve">preceding </w:t>
-      </w:r>
-      <w:r>
-        <w:t>examples assume you want to build all modules except for specific exclusion(s).  If instead you want to build specific module(s) and exclude the rest, you can use the -pl option to specify comma-separated list of modules you wish to build.  In that case, each module is declared without the ! prefix.</w:t>
-      </w:r>
-    </w:p>
-    <w:p>
-      <w:pPr>
-        <w:ind w:left="216"/>
-      </w:pPr>
-    </w:p>
-    <w:p>
-      <w:pPr>
-        <w:pStyle w:val="Heading1"/>
-      </w:pPr>
-      <w:bookmarkStart w:id="62" w:name="_Toc505280678"/>
-      <w:r>
-        <w:t>DEPLOY</w:t>
-      </w:r>
-      <w:r>
-        <w:t xml:space="preserve"> </w:t>
-      </w:r>
-      <w:r>
-        <w:t xml:space="preserve">API </w:t>
-      </w:r>
-      <w:r>
-        <w:t>to SERVICEMIX</w:t>
-      </w:r>
-      <w:bookmarkEnd w:id="62"/>
-    </w:p>
-    <w:p>
-      <w:pPr>
-        <w:ind w:left="216"/>
-      </w:pPr>
-      <w:r>
-        <w:t xml:space="preserve">Find the server version (from the </w:t>
-      </w:r>
-      <w:proofErr w:type="gramStart"/>
-      <w:r>
-        <w:t>top level</w:t>
-      </w:r>
-      <w:proofErr w:type="gramEnd"/>
-      <w:r>
-        <w:t xml:space="preserve"> pom file). You will need to use it in the command to start the server.</w:t>
-      </w:r>
-    </w:p>
-    <w:p>
-      <w:pPr>
-        <w:ind w:left="216"/>
-      </w:pPr>
-      <w:r>
-        <w:t xml:space="preserve">Run </w:t>
-      </w:r>
-      <w:proofErr w:type="spellStart"/>
-      <w:r>
-        <w:t>Servicemix</w:t>
-      </w:r>
-      <w:proofErr w:type="spellEnd"/>
-      <w:r>
-        <w:t xml:space="preserve"> console</w:t>
-      </w:r>
-      <w:r>
-        <w:t xml:space="preserve"> with the command</w:t>
-      </w:r>
-      <w:r>
-        <w:t>:</w:t>
-      </w:r>
-    </w:p>
-    <w:p>
-      <w:pPr>
-        <w:ind w:left="216"/>
-      </w:pPr>
-    </w:p>
-    <w:p>
-      <w:pPr>
-        <w:ind w:left="216"/>
-        <w:rPr>
-          <w:rFonts w:ascii="Courier" w:hAnsi="Courier"/>
-          <w:sz w:val="22"/>
-          <w:szCs w:val="22"/>
-        </w:rPr>
-      </w:pPr>
-      <w:r>
-        <w:t xml:space="preserve"> </w:t>
-      </w:r>
-      <w:proofErr w:type="spellStart"/>
-      <w:r>
-        <w:rPr>
-          <w:rFonts w:ascii="Courier" w:hAnsi="Courier"/>
-          <w:sz w:val="22"/>
-          <w:szCs w:val="22"/>
-        </w:rPr>
-        <w:t>s</w:t>
-      </w:r>
-      <w:r>
-        <w:rPr>
-          <w:rFonts w:ascii="Courier" w:hAnsi="Courier"/>
-          <w:sz w:val="22"/>
-          <w:szCs w:val="22"/>
-        </w:rPr>
-        <w:t>ervicemix</w:t>
-      </w:r>
-      <w:proofErr w:type="spellEnd"/>
-      <w:r>
-        <w:rPr>
-          <w:rFonts w:ascii="Courier" w:hAnsi="Courier"/>
-          <w:sz w:val="22"/>
-          <w:szCs w:val="22"/>
-        </w:rPr>
-        <w:t xml:space="preserve"> clean debug</w:t>
-      </w:r>
-    </w:p>
-    <w:p>
-      <w:pPr>
-        <w:ind w:left="216"/>
-      </w:pPr>
-    </w:p>
-    <w:p>
-      <w:pPr>
-        <w:ind w:left="216"/>
-      </w:pPr>
-      <w:r>
-        <w:rPr>
-          <w:b/>
-          <w:bCs/>
-        </w:rPr>
         <w:t>Note:</w:t>
       </w:r>
       <w:r>
@@ -4849,6 +4894,7 @@
         <w:tab/>
       </w:r>
       <w:proofErr w:type="spellStart"/>
+      <w:proofErr w:type="gramStart"/>
       <w:r>
         <w:rPr>
           <w:rFonts w:ascii="Courier" w:hAnsi="Courier"/>
@@ -4874,7 +4920,17 @@
           <w:sz w:val="22"/>
           <w:szCs w:val="22"/>
         </w:rPr>
-        <w:t>repo-add</w:t>
+        <w:t>repo</w:t>
+      </w:r>
+      <w:proofErr w:type="gramEnd"/>
+      <w:r>
+        <w:rPr>
+          <w:rFonts w:ascii="Courier" w:hAnsi="Courier"/>
+          <w:color w:val="3B2322"/>
+          <w:sz w:val="22"/>
+          <w:szCs w:val="22"/>
+        </w:rPr>
+        <w:t>-add</w:t>
       </w:r>
       <w:proofErr w:type="spellEnd"/>
       <w:r>
@@ -4915,7 +4971,7 @@
         </w:rPr>
         <w:t>&lt;</w:t>
       </w:r>
-      <w:ins w:id="63" w:author="Menon, Sunita (NIH/NCI) [C]" w:date="2021-06-14T00:12:00Z">
+      <w:ins w:id="60" w:author="Menon, Sunita (NIH/NCI) [C]" w:date="2021-06-14T00:12:00Z">
         <w:r>
           <w:rPr>
             <w:rFonts w:ascii="Courier" w:hAnsi="Courier"/>
@@ -4923,7 +4979,7 @@
             <w:color w:val="3B2322"/>
             <w:sz w:val="22"/>
             <w:szCs w:val="22"/>
-            <w:rPrChange w:id="64" w:author="Menon, Sunita (NIH/NCI) [C]" w:date="2021-06-14T00:12:00Z">
+            <w:rPrChange w:id="61" w:author="Menon, Sunita (NIH/NCI) [C]" w:date="2021-06-14T00:12:00Z">
               <w:rPr>
                 <w:rFonts w:ascii="Courier" w:hAnsi="Courier"/>
                 <w:i/>
@@ -4943,7 +4999,7 @@
           <w:color w:val="3B2322"/>
           <w:sz w:val="22"/>
           <w:szCs w:val="22"/>
-          <w:rPrChange w:id="65" w:author="Menon, Sunita (NIH/NCI) [C]" w:date="2021-06-14T00:12:00Z">
+          <w:rPrChange w:id="62" w:author="Menon, Sunita (NIH/NCI) [C]" w:date="2021-06-14T00:12:00Z">
             <w:rPr>
               <w:rFonts w:ascii="Courier" w:hAnsi="Courier"/>
               <w:i/>
@@ -4962,7 +5018,7 @@
           <w:color w:val="3B2322"/>
           <w:sz w:val="22"/>
           <w:szCs w:val="22"/>
-          <w:rPrChange w:id="66" w:author="Menon, Sunita (NIH/NCI) [C]" w:date="2021-06-14T00:10:00Z">
+          <w:rPrChange w:id="63" w:author="Menon, Sunita (NIH/NCI) [C]" w:date="2021-06-14T00:10:00Z">
             <w:rPr>
               <w:rFonts w:ascii="Courier" w:hAnsi="Courier"/>
               <w:i/>
@@ -5024,6 +5080,7 @@
         <w:tab/>
       </w:r>
       <w:proofErr w:type="spellStart"/>
+      <w:proofErr w:type="gramStart"/>
       <w:r>
         <w:rPr>
           <w:rFonts w:ascii="Courier" w:hAnsi="Courier"/>
@@ -5043,6 +5100,7 @@
         <w:t>:install</w:t>
       </w:r>
       <w:proofErr w:type="spellEnd"/>
+      <w:proofErr w:type="gramEnd"/>
       <w:r>
         <w:rPr>
           <w:rFonts w:ascii="Courier" w:hAnsi="Courier"/>
@@ -5081,6 +5139,25 @@
         </w:rPr>
         <w:t>-rest-services</w:t>
       </w:r>
+    </w:p>
+    <w:p>
+      <w:pPr>
+        <w:ind w:left="216"/>
+        <w:rPr>
+          <w:ins w:id="64" w:author="Chintala, Sarada (NIH/NCI) [C]" w:date="2021-07-06T12:15:00Z"/>
+          <w:color w:val="3B2322"/>
+        </w:rPr>
+      </w:pPr>
+    </w:p>
+    <w:p>
+      <w:pPr>
+        <w:ind w:left="216"/>
+        <w:rPr>
+          <w:ins w:id="65" w:author="Menon, Sunita (NIH/NCI) [C]" w:date="2021-06-14T00:11:00Z"/>
+          <w:del w:id="66" w:author="Chintala, Sarada (NIH/NCI) [C]" w:date="2021-07-06T12:16:00Z"/>
+          <w:color w:val="3B2322"/>
+        </w:rPr>
+      </w:pPr>
     </w:p>
     <w:p>
       <w:pPr>
@@ -5090,16 +5167,7 @@
           <w:color w:val="3B2322"/>
         </w:rPr>
       </w:pPr>
-    </w:p>
-    <w:p>
-      <w:pPr>
-        <w:ind w:left="216"/>
-        <w:rPr>
-          <w:ins w:id="68" w:author="Menon, Sunita (NIH/NCI) [C]" w:date="2021-06-14T00:11:00Z"/>
-          <w:color w:val="3B2322"/>
-        </w:rPr>
-      </w:pPr>
-      <w:ins w:id="69" w:author="Menon, Sunita (NIH/NCI) [C]" w:date="2021-06-14T00:11:00Z">
+      <w:ins w:id="68" w:author="Menon, Sunita (NIH/NCI) [C]" w:date="2021-06-14T00:11:00Z">
         <w:r>
           <w:rPr>
             <w:color w:val="3B2322"/>
@@ -5127,17 +5195,16 @@
         <w:ind w:left="216"/>
         <w:jc w:val="left"/>
         <w:rPr>
-          <w:ins w:id="70" w:author="Menon, Sunita (NIH/NCI) [C]" w:date="2021-06-14T00:11:00Z"/>
+          <w:ins w:id="69" w:author="Chintala, Sarada (NIH/NCI) [C]" w:date="2021-07-06T12:16:00Z"/>
+          <w:rFonts w:ascii="Courier" w:hAnsi="Courier"/>
           <w:color w:val="3B2322"/>
-        </w:rPr>
-        <w:pPrChange w:id="71" w:author="Menon, Sunita (NIH/NCI) [C]" w:date="2021-06-14T00:11:00Z">
-          <w:pPr>
-            <w:ind w:left="216"/>
-          </w:pPr>
-        </w:pPrChange>
+          <w:sz w:val="22"/>
+          <w:szCs w:val="22"/>
+        </w:rPr>
       </w:pPr>
       <w:proofErr w:type="spellStart"/>
-      <w:ins w:id="72" w:author="Menon, Sunita (NIH/NCI) [C]" w:date="2021-06-14T00:11:00Z">
+      <w:proofErr w:type="gramStart"/>
+      <w:ins w:id="70" w:author="Menon, Sunita (NIH/NCI) [C]" w:date="2021-06-14T00:11:00Z">
         <w:r>
           <w:rPr>
             <w:rFonts w:ascii="Courier" w:hAnsi="Courier"/>
@@ -5145,7 +5212,17 @@
             <w:sz w:val="22"/>
             <w:szCs w:val="22"/>
           </w:rPr>
-          <w:t>feature:repo-add</w:t>
+          <w:t>feature:repo</w:t>
+        </w:r>
+        <w:proofErr w:type="gramEnd"/>
+        <w:r>
+          <w:rPr>
+            <w:rFonts w:ascii="Courier" w:hAnsi="Courier"/>
+            <w:color w:val="3B2322"/>
+            <w:sz w:val="22"/>
+            <w:szCs w:val="22"/>
+          </w:rPr>
+          <w:t>-add</w:t>
         </w:r>
         <w:proofErr w:type="spellEnd"/>
         <w:r>
@@ -5208,7 +5285,7 @@
           <w:t>/</w:t>
         </w:r>
       </w:ins>
-      <w:ins w:id="73" w:author="Menon, Sunita (NIH/NCI) [C]" w:date="2021-06-14T00:12:00Z">
+      <w:ins w:id="71" w:author="Menon, Sunita (NIH/NCI) [C]" w:date="2021-06-14T00:12:00Z">
         <w:r>
           <w:rPr>
             <w:rFonts w:ascii="Courier" w:hAnsi="Courier"/>
@@ -5216,7 +5293,7 @@
             <w:color w:val="3B2322"/>
             <w:sz w:val="22"/>
             <w:szCs w:val="22"/>
-            <w:rPrChange w:id="74" w:author="Menon, Sunita (NIH/NCI) [C]" w:date="2021-06-14T00:12:00Z">
+            <w:rPrChange w:id="72" w:author="Menon, Sunita (NIH/NCI) [C]" w:date="2021-06-14T00:12:00Z">
               <w:rPr>
                 <w:rFonts w:ascii="Courier" w:hAnsi="Courier"/>
                 <w:i/>
@@ -5229,7 +5306,7 @@
           <w:t>2.8.1</w:t>
         </w:r>
       </w:ins>
-      <w:ins w:id="75" w:author="Menon, Sunita (NIH/NCI) [C]" w:date="2021-06-14T00:11:00Z">
+      <w:ins w:id="73" w:author="Menon, Sunita (NIH/NCI) [C]" w:date="2021-06-14T00:11:00Z">
         <w:r>
           <w:rPr>
             <w:rFonts w:ascii="Courier" w:hAnsi="Courier"/>
@@ -5255,12 +5332,27 @@
       <w:pPr>
         <w:ind w:left="216"/>
         <w:rPr>
+          <w:ins w:id="74" w:author="Menon, Sunita (NIH/NCI) [C]" w:date="2021-06-14T00:11:00Z"/>
+          <w:del w:id="75" w:author="Chintala, Sarada (NIH/NCI) [C]" w:date="2021-07-06T12:16:00Z"/>
           <w:color w:val="3B2322"/>
         </w:rPr>
       </w:pPr>
     </w:p>
     <w:p>
       <w:pPr>
+        <w:ind w:left="0"/>
+        <w:rPr>
+          <w:color w:val="3B2322"/>
+        </w:rPr>
+        <w:pPrChange w:id="76" w:author="Chintala, Sarada (NIH/NCI) [C]" w:date="2021-07-06T12:16:00Z">
+          <w:pPr>
+            <w:ind w:left="216"/>
+          </w:pPr>
+        </w:pPrChange>
+      </w:pPr>
+    </w:p>
+    <w:p>
+      <w:pPr>
         <w:ind w:left="216"/>
         <w:rPr>
           <w:color w:val="3B2322"/>
@@ -5277,6 +5369,7 @@
       <w:pPr>
         <w:ind w:left="216"/>
         <w:rPr>
+          <w:ins w:id="77" w:author="Chintala, Sarada (NIH/NCI) [C]" w:date="2021-07-06T12:16:00Z"/>
           <w:rFonts w:ascii="Courier" w:hAnsi="Courier"/>
           <w:color w:val="3B2322"/>
           <w:sz w:val="22"/>
@@ -5290,6 +5383,7 @@
         <w:tab/>
       </w:r>
       <w:proofErr w:type="spellStart"/>
+      <w:proofErr w:type="gramStart"/>
       <w:r>
         <w:rPr>
           <w:rFonts w:ascii="Courier" w:hAnsi="Courier"/>
@@ -5300,6 +5394,7 @@
         <w:t>feature:install</w:t>
       </w:r>
       <w:proofErr w:type="spellEnd"/>
+      <w:proofErr w:type="gramEnd"/>
       <w:r>
         <w:rPr>
           <w:rFonts w:ascii="Courier" w:hAnsi="Courier"/>
@@ -5329,6 +5424,90 @@
         </w:rPr>
         <w:t>-server-scheduler</w:t>
       </w:r>
+    </w:p>
+    <w:p>
+      <w:pPr>
+        <w:ind w:left="216"/>
+        <w:rPr>
+          <w:ins w:id="78" w:author="Chintala, Sarada (NIH/NCI) [C]" w:date="2021-07-06T12:16:00Z"/>
+          <w:rFonts w:ascii="Courier" w:hAnsi="Courier"/>
+          <w:color w:val="3B2322"/>
+          <w:sz w:val="22"/>
+          <w:szCs w:val="22"/>
+        </w:rPr>
+      </w:pPr>
+    </w:p>
+    <w:p>
+      <w:pPr>
+        <w:ind w:left="216"/>
+        <w:rPr>
+          <w:color w:val="3B2322"/>
+          <w:rPrChange w:id="79" w:author="Chintala, Sarada (NIH/NCI) [C]" w:date="2021-07-06T12:16:00Z">
+            <w:rPr>
+              <w:rFonts w:ascii="Courier" w:hAnsi="Courier"/>
+              <w:color w:val="3B2322"/>
+              <w:sz w:val="22"/>
+              <w:szCs w:val="22"/>
+            </w:rPr>
+          </w:rPrChange>
+        </w:rPr>
+      </w:pPr>
+      <w:ins w:id="80" w:author="Chintala, Sarada (NIH/NCI) [C]" w:date="2021-07-06T12:16:00Z">
+        <w:r>
+          <w:rPr>
+            <w:color w:val="3B2322"/>
+          </w:rPr>
+          <w:t xml:space="preserve">After the install, remain in </w:t>
+        </w:r>
+      </w:ins>
+      <w:proofErr w:type="spellStart"/>
+      <w:ins w:id="81" w:author="Chintala, Sarada (NIH/NCI) [C]" w:date="2021-07-06T12:17:00Z">
+        <w:r>
+          <w:rPr>
+            <w:color w:val="3B2322"/>
+          </w:rPr>
+          <w:t>S</w:t>
+        </w:r>
+      </w:ins>
+      <w:ins w:id="82" w:author="Chintala, Sarada (NIH/NCI) [C]" w:date="2021-07-06T12:16:00Z">
+        <w:r>
+          <w:rPr>
+            <w:color w:val="3B2322"/>
+          </w:rPr>
+          <w:t>erviceMi</w:t>
+        </w:r>
+        <w:r>
+          <w:rPr>
+            <w:color w:val="3B2322"/>
+          </w:rPr>
+          <w:t>x</w:t>
+        </w:r>
+      </w:ins>
+      <w:proofErr w:type="spellEnd"/>
+      <w:ins w:id="83" w:author="Chintala, Sarada (NIH/NCI) [C]" w:date="2021-07-06T12:17:00Z">
+        <w:r>
+          <w:rPr>
+            <w:color w:val="3B2322"/>
+          </w:rPr>
+          <w:t xml:space="preserve"> console</w:t>
+        </w:r>
+      </w:ins>
+      <w:ins w:id="84" w:author="Chintala, Sarada (NIH/NCI) [C]" w:date="2021-07-06T12:16:00Z">
+        <w:r>
+          <w:rPr>
+            <w:color w:val="3B2322"/>
+          </w:rPr>
+          <w:t xml:space="preserve"> for the server to continu</w:t>
+        </w:r>
+      </w:ins>
+      <w:ins w:id="85" w:author="Chintala, Sarada (NIH/NCI) [C]" w:date="2021-07-06T12:17:00Z">
+        <w:r>
+          <w:rPr>
+            <w:color w:val="3B2322"/>
+          </w:rPr>
+          <w:t>e running.</w:t>
+        </w:r>
+      </w:ins>
     </w:p>
     <w:p>
       <w:pPr>
@@ -5425,7 +5604,28 @@
         <w:rPr>
           <w:color w:val="3B2322"/>
         </w:rPr>
-        <w:t xml:space="preserve"> server with DEV and  the scheduler is running there. Having 2 scheduler running (pointing to the same </w:t>
+        <w:t xml:space="preserve"> server with DEV </w:t>
+      </w:r>
+      <w:proofErr w:type="gramStart"/>
+      <w:r>
+        <w:rPr>
+          <w:color w:val="3B2322"/>
+        </w:rPr>
+        <w:t>and  the</w:t>
+      </w:r>
+      <w:proofErr w:type="gramEnd"/>
+      <w:r>
+        <w:rPr>
+          <w:color w:val="3B2322"/>
+        </w:rPr>
+        <w:t xml:space="preserve"> scheduler </w:t>
+      </w:r>
+      <w:r>
+        <w:rPr>
+          <w:color w:val="3B2322"/>
+        </w:rPr>
+        <w:lastRenderedPageBreak/>
+        <w:t xml:space="preserve">is running there. Having 2 scheduler running (pointing to the same </w:t>
       </w:r>
       <w:proofErr w:type="spellStart"/>
       <w:r>
@@ -5457,11 +5657,11 @@
       <w:pPr>
         <w:pStyle w:val="Heading1"/>
       </w:pPr>
-      <w:bookmarkStart w:id="76" w:name="_Toc505280679"/>
+      <w:bookmarkStart w:id="86" w:name="_Toc505280679"/>
       <w:r>
         <w:t>ENDPOINTS</w:t>
       </w:r>
-      <w:bookmarkEnd w:id="76"/>
+      <w:bookmarkEnd w:id="86"/>
     </w:p>
     <w:p>
       <w:pPr>
@@ -5470,14 +5670,87 @@
       <w:r>
         <w:t xml:space="preserve">HPC DM Services are deployed to </w:t>
       </w:r>
-      <w:hyperlink r:id="rId17" w:history="1">
+      <w:ins w:id="87" w:author="Chintala, Sarada (NIH/NCI) [C]" w:date="2021-07-06T11:58:00Z">
+        <w:r>
+          <w:fldChar w:fldCharType="begin"/>
+        </w:r>
+        <w:r>
+          <w:instrText xml:space="preserve"> HYPERLINK "</w:instrText>
+        </w:r>
+      </w:ins>
+      <w:r>
+        <w:rPr>
+          <w:rPrChange w:id="88" w:author="Chintala, Sarada (NIH/NCI) [C]" w:date="2021-07-06T11:58:00Z">
+            <w:rPr>
+              <w:rStyle w:val="Hyperlink"/>
+            </w:rPr>
+          </w:rPrChange>
+        </w:rPr>
+        <w:instrText>https://localhost:7</w:instrText>
+      </w:r>
+      <w:ins w:id="89" w:author="Chintala, Sarada (NIH/NCI) [C]" w:date="2021-07-06T11:58:00Z">
+        <w:r>
+          <w:rPr>
+            <w:rPrChange w:id="90" w:author="Chintala, Sarada (NIH/NCI) [C]" w:date="2021-07-06T11:58:00Z">
+              <w:rPr>
+                <w:rStyle w:val="Hyperlink"/>
+              </w:rPr>
+            </w:rPrChange>
+          </w:rPr>
+          <w:instrText>7</w:instrText>
+        </w:r>
+      </w:ins>
+      <w:r>
+        <w:rPr>
+          <w:rPrChange w:id="91" w:author="Chintala, Sarada (NIH/NCI) [C]" w:date="2021-07-06T11:58:00Z">
+            <w:rPr>
+              <w:rStyle w:val="Hyperlink"/>
+            </w:rPr>
+          </w:rPrChange>
+        </w:rPr>
+        <w:instrText>38/hpc-server/&lt;hpc-service</w:instrText>
+      </w:r>
+      <w:ins w:id="92" w:author="Chintala, Sarada (NIH/NCI) [C]" w:date="2021-07-06T11:58:00Z">
+        <w:r>
+          <w:instrText xml:space="preserve">" </w:instrText>
+        </w:r>
+        <w:r>
+          <w:fldChar w:fldCharType="separate"/>
+        </w:r>
+      </w:ins>
+      <w:r>
+        <w:rPr>
+          <w:rStyle w:val="Hyperlink"/>
+        </w:rPr>
+        <w:t>https://localhost:7</w:t>
+      </w:r>
+      <w:ins w:id="93" w:author="Chintala, Sarada (NIH/NCI) [C]" w:date="2021-07-06T11:58:00Z">
         <w:r>
           <w:rPr>
             <w:rStyle w:val="Hyperlink"/>
           </w:rPr>
-          <w:t>https://localhost:7338/hpc-server/&lt;hpc-service</w:t>
-        </w:r>
-      </w:hyperlink>
+          <w:t>7</w:t>
+        </w:r>
+      </w:ins>
+      <w:del w:id="94" w:author="Chintala, Sarada (NIH/NCI) [C]" w:date="2021-07-06T11:58:00Z">
+        <w:r>
+          <w:rPr>
+            <w:rStyle w:val="Hyperlink"/>
+          </w:rPr>
+          <w:delText>3</w:delText>
+        </w:r>
+      </w:del>
+      <w:r>
+        <w:rPr>
+          <w:rStyle w:val="Hyperlink"/>
+        </w:rPr>
+        <w:t>38/hpc-server/&lt;hpc-service</w:t>
+      </w:r>
+      <w:ins w:id="95" w:author="Chintala, Sarada (NIH/NCI) [C]" w:date="2021-07-06T11:58:00Z">
+        <w:r>
+          <w:fldChar w:fldCharType="end"/>
+        </w:r>
+      </w:ins>
       <w:r>
         <w:t>&gt;</w:t>
       </w:r>
@@ -5506,14 +5779,14 @@
       <w:pPr>
         <w:pStyle w:val="Heading1"/>
       </w:pPr>
-      <w:bookmarkStart w:id="77" w:name="_Toc505280681"/>
+      <w:bookmarkStart w:id="96" w:name="_Toc505280681"/>
       <w:r>
         <w:t xml:space="preserve">HPCDME </w:t>
       </w:r>
       <w:r>
         <w:t>WEB Client</w:t>
       </w:r>
-      <w:bookmarkEnd w:id="77"/>
+      <w:bookmarkEnd w:id="96"/>
     </w:p>
     <w:p>
       <w:pPr>
@@ -5617,6 +5890,7 @@
         <w:t>–</w:t>
       </w:r>
       <w:proofErr w:type="spellStart"/>
+      <w:proofErr w:type="gramStart"/>
       <w:r>
         <w:rPr>
           <w:rFonts w:ascii="Courier" w:hAnsi="Courier"/>
@@ -5626,6 +5900,7 @@
         <w:t>Xrunjdwp:server</w:t>
       </w:r>
       <w:proofErr w:type="spellEnd"/>
+      <w:proofErr w:type="gramEnd"/>
       <w:r>
         <w:rPr>
           <w:rFonts w:ascii="Courier" w:hAnsi="Courier"/>
@@ -5671,7 +5946,7 @@
         <w:t>=5015 –jar target/</w:t>
       </w:r>
       <w:proofErr w:type="spellStart"/>
-      <w:del w:id="78" w:author="Menon, Sunita (NIH/NCI) [C]" w:date="2021-06-14T00:09:00Z">
+      <w:del w:id="97" w:author="Menon, Sunita (NIH/NCI) [C]" w:date="2021-06-14T00:09:00Z">
         <w:r>
           <w:rPr>
             <w:rFonts w:ascii="Courier" w:hAnsi="Courier"/>
@@ -5727,12 +6002,12 @@
       <w:r>
         <w:t xml:space="preserve"> if the version number is </w:t>
       </w:r>
-      <w:ins w:id="79" w:author="Menon, Sunita (NIH/NCI) [C]" w:date="2021-06-13T23:49:00Z">
+      <w:ins w:id="98" w:author="Menon, Sunita (NIH/NCI) [C]" w:date="2021-06-13T23:49:00Z">
         <w:r>
           <w:t>2</w:t>
         </w:r>
       </w:ins>
-      <w:del w:id="80" w:author="Menon, Sunita (NIH/NCI) [C]" w:date="2021-06-13T23:49:00Z">
+      <w:del w:id="99" w:author="Menon, Sunita (NIH/NCI) [C]" w:date="2021-06-13T23:49:00Z">
         <w:r>
           <w:delText>1</w:delText>
         </w:r>
@@ -5740,12 +6015,19 @@
       <w:r>
         <w:t>.</w:t>
       </w:r>
-      <w:ins w:id="81" w:author="Menon, Sunita (NIH/NCI) [C]" w:date="2021-06-13T23:49:00Z">
-        <w:r>
-          <w:t>8</w:t>
+      <w:ins w:id="100" w:author="Chintala, Sarada (NIH/NCI) [C]" w:date="2021-07-06T12:11:00Z">
+        <w:r>
+          <w:t>9</w:t>
         </w:r>
       </w:ins>
-      <w:del w:id="82" w:author="Menon, Sunita (NIH/NCI) [C]" w:date="2021-06-13T23:49:00Z">
+      <w:ins w:id="101" w:author="Menon, Sunita (NIH/NCI) [C]" w:date="2021-06-13T23:49:00Z">
+        <w:del w:id="102" w:author="Chintala, Sarada (NIH/NCI) [C]" w:date="2021-07-06T12:11:00Z">
+          <w:r>
+            <w:delText>8</w:delText>
+          </w:r>
+        </w:del>
+      </w:ins>
+      <w:del w:id="103" w:author="Menon, Sunita (NIH/NCI) [C]" w:date="2021-06-13T23:49:00Z">
         <w:r>
           <w:delText>1</w:delText>
         </w:r>
@@ -5763,6 +6045,9 @@
     <w:p>
       <w:pPr>
         <w:ind w:left="216"/>
+        <w:rPr>
+          <w:del w:id="104" w:author="Chintala, Sarada (NIH/NCI) [C]" w:date="2021-07-06T12:10:00Z"/>
+        </w:rPr>
       </w:pPr>
     </w:p>
     <w:p>
@@ -5770,138 +6055,65 @@
         <w:ind w:left="216"/>
         <w:jc w:val="left"/>
         <w:rPr>
-          <w:rFonts w:ascii="Courier" w:hAnsi="Courier"/>
-          <w:sz w:val="22"/>
-          <w:szCs w:val="22"/>
-        </w:rPr>
-      </w:pPr>
-      <w:r>
-        <w:rPr>
-          <w:rFonts w:ascii="Courier" w:hAnsi="Courier"/>
-          <w:sz w:val="22"/>
-          <w:szCs w:val="22"/>
-        </w:rPr>
-        <w:t>java –</w:t>
-      </w:r>
-      <w:proofErr w:type="spellStart"/>
-      <w:r>
-        <w:rPr>
-          <w:rFonts w:ascii="Courier" w:hAnsi="Courier"/>
-          <w:sz w:val="22"/>
-          <w:szCs w:val="22"/>
-        </w:rPr>
-        <w:t>Xdebug</w:t>
-      </w:r>
-      <w:proofErr w:type="spellEnd"/>
-      <w:r>
-        <w:rPr>
-          <w:rFonts w:ascii="Courier" w:hAnsi="Courier"/>
-          <w:sz w:val="22"/>
-          <w:szCs w:val="22"/>
-        </w:rPr>
-        <w:t xml:space="preserve"> –</w:t>
-      </w:r>
-      <w:proofErr w:type="spellStart"/>
-      <w:r>
-        <w:rPr>
-          <w:rFonts w:ascii="Courier" w:hAnsi="Courier"/>
-          <w:sz w:val="22"/>
-          <w:szCs w:val="22"/>
-        </w:rPr>
-        <w:t>Xrunjdwp:server</w:t>
-      </w:r>
-      <w:proofErr w:type="spellEnd"/>
-      <w:r>
-        <w:rPr>
-          <w:rFonts w:ascii="Courier" w:hAnsi="Courier"/>
-          <w:sz w:val="22"/>
-          <w:szCs w:val="22"/>
-        </w:rPr>
-        <w:t>=y, transport=</w:t>
-      </w:r>
-      <w:proofErr w:type="spellStart"/>
-      <w:r>
-        <w:rPr>
-          <w:rFonts w:ascii="Courier" w:hAnsi="Courier"/>
-          <w:sz w:val="22"/>
-          <w:szCs w:val="22"/>
-        </w:rPr>
-        <w:t>dt_socket,suspend</w:t>
-      </w:r>
-      <w:proofErr w:type="spellEnd"/>
-      <w:r>
-        <w:rPr>
-          <w:rFonts w:ascii="Courier" w:hAnsi="Courier"/>
-          <w:sz w:val="22"/>
-          <w:szCs w:val="22"/>
-        </w:rPr>
-        <w:t>=</w:t>
-      </w:r>
-      <w:proofErr w:type="spellStart"/>
-      <w:r>
-        <w:rPr>
-          <w:rFonts w:ascii="Courier" w:hAnsi="Courier"/>
-          <w:sz w:val="22"/>
-          <w:szCs w:val="22"/>
-        </w:rPr>
-        <w:t>n,address</w:t>
-      </w:r>
-      <w:proofErr w:type="spellEnd"/>
-      <w:r>
-        <w:rPr>
-          <w:rFonts w:ascii="Courier" w:hAnsi="Courier"/>
-          <w:sz w:val="22"/>
-          <w:szCs w:val="22"/>
-        </w:rPr>
-        <w:t>=5015 –jar target/hpc-web</w:t>
-      </w:r>
-      <w:r>
-        <w:rPr>
-          <w:rFonts w:ascii="Courier" w:hAnsi="Courier"/>
-          <w:sz w:val="22"/>
-          <w:szCs w:val="22"/>
-        </w:rPr>
-        <w:t>-</w:t>
-      </w:r>
-      <w:ins w:id="83" w:author="Menon, Sunita (NIH/NCI) [C]" w:date="2021-06-13T23:49:00Z">
+          <w:del w:id="105" w:author="Chintala, Sarada (NIH/NCI) [C]" w:date="2021-07-06T12:10:00Z"/>
+          <w:rFonts w:ascii="Courier" w:hAnsi="Courier"/>
+          <w:sz w:val="22"/>
+          <w:szCs w:val="22"/>
+        </w:rPr>
+      </w:pPr>
+      <w:del w:id="106" w:author="Chintala, Sarada (NIH/NCI) [C]" w:date="2021-07-06T12:10:00Z">
         <w:r>
           <w:rPr>
             <w:rFonts w:ascii="Courier" w:hAnsi="Courier"/>
             <w:sz w:val="22"/>
             <w:szCs w:val="22"/>
           </w:rPr>
-          <w:t>2</w:t>
-        </w:r>
-      </w:ins>
-      <w:del w:id="84" w:author="Menon, Sunita (NIH/NCI) [C]" w:date="2021-06-13T23:49:00Z">
+          <w:delText>java –Xdebug –Xrunjdwp:server=y, transport=dt_socket,suspend=n,address=5015 –jar target/hpc-web</w:delText>
+        </w:r>
         <w:r>
           <w:rPr>
             <w:rFonts w:ascii="Courier" w:hAnsi="Courier"/>
             <w:sz w:val="22"/>
             <w:szCs w:val="22"/>
           </w:rPr>
-          <w:delText>1</w:delText>
+          <w:delText>-</w:delText>
         </w:r>
       </w:del>
-      <w:r>
-        <w:rPr>
-          <w:rFonts w:ascii="Courier" w:hAnsi="Courier"/>
-          <w:sz w:val="22"/>
-          <w:szCs w:val="22"/>
-        </w:rPr>
-        <w:t>.</w:t>
-      </w:r>
-      <w:ins w:id="85" w:author="Menon, Sunita (NIH/NCI) [C]" w:date="2021-06-13T23:49:00Z">
+      <w:ins w:id="107" w:author="Menon, Sunita (NIH/NCI) [C]" w:date="2021-06-13T23:49:00Z">
+        <w:del w:id="108" w:author="Chintala, Sarada (NIH/NCI) [C]" w:date="2021-07-06T12:10:00Z">
+          <w:r>
+            <w:rPr>
+              <w:rFonts w:ascii="Courier" w:hAnsi="Courier"/>
+              <w:sz w:val="22"/>
+              <w:szCs w:val="22"/>
+            </w:rPr>
+            <w:delText>2</w:delText>
+          </w:r>
+        </w:del>
+      </w:ins>
+      <w:del w:id="109" w:author="Chintala, Sarada (NIH/NCI) [C]" w:date="2021-07-06T12:10:00Z">
         <w:r>
           <w:rPr>
             <w:rFonts w:ascii="Courier" w:hAnsi="Courier"/>
             <w:sz w:val="22"/>
             <w:szCs w:val="22"/>
           </w:rPr>
-          <w:t>8</w:t>
-        </w:r>
+          <w:delText>1.</w:delText>
+        </w:r>
+      </w:del>
+      <w:ins w:id="110" w:author="Menon, Sunita (NIH/NCI) [C]" w:date="2021-06-13T23:49:00Z">
+        <w:del w:id="111" w:author="Chintala, Sarada (NIH/NCI) [C]" w:date="2021-07-06T12:10:00Z">
+          <w:r>
+            <w:rPr>
+              <w:rFonts w:ascii="Courier" w:hAnsi="Courier"/>
+              <w:sz w:val="22"/>
+              <w:szCs w:val="22"/>
+            </w:rPr>
+            <w:delText>8</w:delText>
+          </w:r>
+        </w:del>
       </w:ins>
-      <w:del w:id="86" w:author="Menon, Sunita (NIH/NCI) [C]" w:date="2021-06-13T23:49:00Z">
+      <w:del w:id="112" w:author="Chintala, Sarada (NIH/NCI) [C]" w:date="2021-07-06T12:10:00Z">
         <w:r>
           <w:rPr>
             <w:rFonts w:ascii="Courier" w:hAnsi="Courier"/>
@@ -5918,20 +6130,117 @@
           </w:rPr>
           <w:delText>6</w:delText>
         </w:r>
+        <w:r>
+          <w:rPr>
+            <w:rFonts w:ascii="Courier" w:hAnsi="Courier"/>
+            <w:sz w:val="22"/>
+            <w:szCs w:val="22"/>
+          </w:rPr>
+          <w:delText xml:space="preserve">.0.war </w:delText>
+        </w:r>
       </w:del>
-      <w:r>
-        <w:rPr>
-          <w:rFonts w:ascii="Courier" w:hAnsi="Courier"/>
-          <w:sz w:val="22"/>
-          <w:szCs w:val="22"/>
-        </w:rPr>
-        <w:t xml:space="preserve">.0.war </w:t>
-      </w:r>
     </w:p>
     <w:p>
       <w:pPr>
         <w:ind w:left="0"/>
-      </w:pPr>
+        <w:rPr>
+          <w:ins w:id="113" w:author="Chintala, Sarada (NIH/NCI) [C]" w:date="2021-07-06T12:09:00Z"/>
+        </w:rPr>
+      </w:pPr>
+    </w:p>
+    <w:p>
+      <w:pPr>
+        <w:ind w:left="216"/>
+        <w:pPrChange w:id="114" w:author="Chintala, Sarada (NIH/NCI) [C]" w:date="2021-07-06T12:10:00Z">
+          <w:pPr>
+            <w:ind w:left="0"/>
+          </w:pPr>
+        </w:pPrChange>
+      </w:pPr>
+      <w:ins w:id="115" w:author="Chintala, Sarada (NIH/NCI) [C]" w:date="2021-07-06T12:09:00Z">
+        <w:r>
+          <w:rPr>
+            <w:rFonts w:ascii="AppleSystemUIFont" w:hAnsi="AppleSystemUIFont" w:cs="AppleSystemUIFont"/>
+            <w:sz w:val="26"/>
+            <w:szCs w:val="26"/>
+          </w:rPr>
+          <w:t>java -</w:t>
+        </w:r>
+        <w:proofErr w:type="spellStart"/>
+        <w:r>
+          <w:rPr>
+            <w:rFonts w:ascii="AppleSystemUIFont" w:hAnsi="AppleSystemUIFont" w:cs="AppleSystemUIFont"/>
+            <w:sz w:val="26"/>
+            <w:szCs w:val="26"/>
+          </w:rPr>
+          <w:t>Xdebug</w:t>
+        </w:r>
+        <w:proofErr w:type="spellEnd"/>
+        <w:r>
+          <w:rPr>
+            <w:rFonts w:ascii="AppleSystemUIFont" w:hAnsi="AppleSystemUIFont" w:cs="AppleSystemUIFont"/>
+            <w:sz w:val="26"/>
+            <w:szCs w:val="26"/>
+          </w:rPr>
+          <w:t xml:space="preserve"> -</w:t>
+        </w:r>
+        <w:proofErr w:type="spellStart"/>
+        <w:proofErr w:type="gramStart"/>
+        <w:r>
+          <w:rPr>
+            <w:rFonts w:ascii="AppleSystemUIFont" w:hAnsi="AppleSystemUIFont" w:cs="AppleSystemUIFont"/>
+            <w:sz w:val="26"/>
+            <w:szCs w:val="26"/>
+          </w:rPr>
+          <w:t>Xrunjdwp:transport</w:t>
+        </w:r>
+        <w:proofErr w:type="spellEnd"/>
+        <w:proofErr w:type="gramEnd"/>
+        <w:r>
+          <w:rPr>
+            <w:rFonts w:ascii="AppleSystemUIFont" w:hAnsi="AppleSystemUIFont" w:cs="AppleSystemUIFont"/>
+            <w:sz w:val="26"/>
+            <w:szCs w:val="26"/>
+          </w:rPr>
+          <w:t>=</w:t>
+        </w:r>
+        <w:proofErr w:type="spellStart"/>
+        <w:r>
+          <w:rPr>
+            <w:rFonts w:ascii="AppleSystemUIFont" w:hAnsi="AppleSystemUIFont" w:cs="AppleSystemUIFont"/>
+            <w:sz w:val="26"/>
+            <w:szCs w:val="26"/>
+          </w:rPr>
+          <w:t>dt_socket,address</w:t>
+        </w:r>
+        <w:proofErr w:type="spellEnd"/>
+        <w:r>
+          <w:rPr>
+            <w:rFonts w:ascii="AppleSystemUIFont" w:hAnsi="AppleSystemUIFont" w:cs="AppleSystemUIFont"/>
+            <w:sz w:val="26"/>
+            <w:szCs w:val="26"/>
+          </w:rPr>
+          <w:t>=5025,server=</w:t>
+        </w:r>
+        <w:proofErr w:type="spellStart"/>
+        <w:r>
+          <w:rPr>
+            <w:rFonts w:ascii="AppleSystemUIFont" w:hAnsi="AppleSystemUIFont" w:cs="AppleSystemUIFont"/>
+            <w:sz w:val="26"/>
+            <w:szCs w:val="26"/>
+          </w:rPr>
+          <w:t>y,suspend</w:t>
+        </w:r>
+        <w:proofErr w:type="spellEnd"/>
+        <w:r>
+          <w:rPr>
+            <w:rFonts w:ascii="AppleSystemUIFont" w:hAnsi="AppleSystemUIFont" w:cs="AppleSystemUIFont"/>
+            <w:sz w:val="26"/>
+            <w:szCs w:val="26"/>
+          </w:rPr>
+          <w:t>=n -jar target/hpc-web-2.9.0.war</w:t>
+        </w:r>
+      </w:ins>
     </w:p>
     <w:p>
       <w:pPr>
@@ -5968,7 +6277,7 @@
         <w:ind w:left="0" w:firstLine="216"/>
         <w:jc w:val="left"/>
       </w:pPr>
-      <w:hyperlink r:id="rId18" w:history="1">
+      <w:hyperlink r:id="rId17" w:history="1">
         <w:r>
           <w:rPr>
             <w:rStyle w:val="Hyperlink"/>
@@ -6003,7 +6312,7 @@
       <w:pPr>
         <w:pStyle w:val="Heading1"/>
       </w:pPr>
-      <w:bookmarkStart w:id="87" w:name="_Toc505280682"/>
+      <w:bookmarkStart w:id="116" w:name="_Toc505280682"/>
       <w:r>
         <w:t xml:space="preserve">HPCDME </w:t>
       </w:r>
@@ -6013,7 +6322,7 @@
       <w:r>
         <w:t>CLI Client</w:t>
       </w:r>
-      <w:bookmarkEnd w:id="87"/>
+      <w:bookmarkEnd w:id="116"/>
     </w:p>
     <w:p>
       <w:pPr>
@@ -6044,18 +6353,21 @@
         <w:t>&lt;Path to HPC_DME_APIs&gt;/utils</w:t>
       </w:r>
       <w:r>
-        <w:t xml:space="preserve"> directory </w:t>
-      </w:r>
-      <w:r>
-        <w:t xml:space="preserve"> in the source tree  </w:t>
+        <w:t xml:space="preserve"> </w:t>
       </w:r>
       <w:proofErr w:type="gramStart"/>
       <w:r>
-        <w:t>e.g.</w:t>
+        <w:t xml:space="preserve">directory </w:t>
+      </w:r>
+      <w:r>
+        <w:t xml:space="preserve"> in</w:t>
       </w:r>
       <w:proofErr w:type="gramEnd"/>
       <w:r>
-        <w:t xml:space="preserve"> /Development/HPC_DME_APIs/utils</w:t>
+        <w:t xml:space="preserve"> the source tree  </w:t>
+      </w:r>
+      <w:r>
+        <w:t>e.g. /Development/HPC_DME_APIs/utils</w:t>
       </w:r>
     </w:p>
     <w:p/>
@@ -6082,7 +6394,15 @@
       </w:r>
       <w:proofErr w:type="spellEnd"/>
       <w:r>
-        <w:t xml:space="preserve"> from  $SERVICE_MIX_HOME/</w:t>
+        <w:t xml:space="preserve"> </w:t>
+      </w:r>
+      <w:proofErr w:type="gramStart"/>
+      <w:r>
+        <w:t>from  $</w:t>
+      </w:r>
+      <w:proofErr w:type="gramEnd"/>
+      <w:r>
+        <w:t>SERVICE_MIX_HOME/</w:t>
       </w:r>
       <w:proofErr w:type="spellStart"/>
       <w:r>
@@ -6230,13 +6550,23 @@
         </w:rPr>
       </w:pPr>
       <w:proofErr w:type="spellStart"/>
-      <w:r>
-        <w:rPr>
-          <w:rFonts w:ascii="Courier" w:hAnsi="Courier"/>
-          <w:sz w:val="22"/>
-          <w:szCs w:val="22"/>
-        </w:rPr>
-        <w:t>hpc.ssl.keystore.path</w:t>
+      <w:proofErr w:type="gramStart"/>
+      <w:r>
+        <w:rPr>
+          <w:rFonts w:ascii="Courier" w:hAnsi="Courier"/>
+          <w:sz w:val="22"/>
+          <w:szCs w:val="22"/>
+        </w:rPr>
+        <w:t>hpc.ssl.keystore</w:t>
+      </w:r>
+      <w:proofErr w:type="gramEnd"/>
+      <w:r>
+        <w:rPr>
+          <w:rFonts w:ascii="Courier" w:hAnsi="Courier"/>
+          <w:sz w:val="22"/>
+          <w:szCs w:val="22"/>
+        </w:rPr>
+        <w:t>.path</w:t>
       </w:r>
       <w:proofErr w:type="spellEnd"/>
       <w:r>
@@ -6292,13 +6622,24 @@
         </w:rPr>
       </w:pPr>
       <w:proofErr w:type="spellStart"/>
-      <w:r>
-        <w:rPr>
-          <w:rFonts w:ascii="Courier" w:hAnsi="Courier"/>
-          <w:sz w:val="22"/>
-          <w:szCs w:val="22"/>
-        </w:rPr>
-        <w:t>hpc.ssl.keystore.password</w:t>
+      <w:proofErr w:type="gramStart"/>
+      <w:r>
+        <w:rPr>
+          <w:rFonts w:ascii="Courier" w:hAnsi="Courier"/>
+          <w:sz w:val="22"/>
+          <w:szCs w:val="22"/>
+        </w:rPr>
+        <w:lastRenderedPageBreak/>
+        <w:t>hpc.ssl.keystore</w:t>
+      </w:r>
+      <w:proofErr w:type="gramEnd"/>
+      <w:r>
+        <w:rPr>
+          <w:rFonts w:ascii="Courier" w:hAnsi="Courier"/>
+          <w:sz w:val="22"/>
+          <w:szCs w:val="22"/>
+        </w:rPr>
+        <w:t>.password</w:t>
       </w:r>
       <w:proofErr w:type="spellEnd"/>
       <w:r>
@@ -6476,6 +6817,7 @@
         <w:t xml:space="preserve"> –</w:t>
       </w:r>
       <w:proofErr w:type="spellStart"/>
+      <w:proofErr w:type="gramStart"/>
       <w:r>
         <w:rPr>
           <w:rFonts w:ascii="Courier" w:hAnsi="Courier"/>
@@ -6485,6 +6827,7 @@
         <w:t>Xrunjdwp:server</w:t>
       </w:r>
       <w:proofErr w:type="spellEnd"/>
+      <w:proofErr w:type="gramEnd"/>
       <w:r>
         <w:rPr>
           <w:rFonts w:ascii="Courier" w:hAnsi="Courier"/>
@@ -6626,7 +6969,7 @@
         <w:t>/</w:t>
       </w:r>
       <w:proofErr w:type="spellStart"/>
-      <w:del w:id="88" w:author="Menon, Sunita (NIH/NCI) [C]" w:date="2021-06-14T00:10:00Z">
+      <w:del w:id="117" w:author="Menon, Sunita (NIH/NCI) [C]" w:date="2021-06-14T00:10:00Z">
         <w:r>
           <w:rPr>
             <w:rFonts w:ascii="Courier" w:hAnsi="Courier"/>
@@ -6710,12 +7053,12 @@
       <w:r>
         <w:t xml:space="preserve"> if the version number is </w:t>
       </w:r>
-      <w:ins w:id="89" w:author="Menon, Sunita (NIH/NCI) [C]" w:date="2021-06-13T23:50:00Z">
+      <w:ins w:id="118" w:author="Menon, Sunita (NIH/NCI) [C]" w:date="2021-06-13T23:50:00Z">
         <w:r>
           <w:t>2</w:t>
         </w:r>
       </w:ins>
-      <w:del w:id="90" w:author="Menon, Sunita (NIH/NCI) [C]" w:date="2021-06-13T23:50:00Z">
+      <w:del w:id="119" w:author="Menon, Sunita (NIH/NCI) [C]" w:date="2021-06-13T23:50:00Z">
         <w:r>
           <w:delText>1</w:delText>
         </w:r>
@@ -6723,12 +7066,12 @@
       <w:r>
         <w:t>.</w:t>
       </w:r>
-      <w:ins w:id="91" w:author="Menon, Sunita (NIH/NCI) [C]" w:date="2021-06-13T23:50:00Z">
+      <w:ins w:id="120" w:author="Menon, Sunita (NIH/NCI) [C]" w:date="2021-06-13T23:50:00Z">
         <w:r>
           <w:t>8</w:t>
         </w:r>
       </w:ins>
-      <w:del w:id="92" w:author="Menon, Sunita (NIH/NCI) [C]" w:date="2021-06-13T23:50:00Z">
+      <w:del w:id="121" w:author="Menon, Sunita (NIH/NCI) [C]" w:date="2021-06-13T23:50:00Z">
         <w:r>
           <w:delText>1</w:delText>
         </w:r>
@@ -6796,6 +7139,7 @@
         <w:t xml:space="preserve"> –</w:t>
       </w:r>
       <w:proofErr w:type="spellStart"/>
+      <w:proofErr w:type="gramStart"/>
       <w:r>
         <w:rPr>
           <w:rFonts w:ascii="Courier" w:hAnsi="Courier"/>
@@ -6805,6 +7149,7 @@
         <w:t>Xrunjdwp:server</w:t>
       </w:r>
       <w:proofErr w:type="spellEnd"/>
+      <w:proofErr w:type="gramEnd"/>
       <w:r>
         <w:rPr>
           <w:rFonts w:ascii="Courier" w:hAnsi="Courier"/>
@@ -6903,7 +7248,7 @@
         </w:rPr>
         <w:t>-client/hpc-cli-</w:t>
       </w:r>
-      <w:ins w:id="93" w:author="Menon, Sunita (NIH/NCI) [C]" w:date="2021-06-13T23:50:00Z">
+      <w:ins w:id="122" w:author="Menon, Sunita (NIH/NCI) [C]" w:date="2021-06-13T23:50:00Z">
         <w:r>
           <w:rPr>
             <w:rFonts w:ascii="Courier" w:hAnsi="Courier"/>
@@ -6913,7 +7258,7 @@
           <w:t>2</w:t>
         </w:r>
       </w:ins>
-      <w:del w:id="94" w:author="Menon, Sunita (NIH/NCI) [C]" w:date="2021-06-13T23:50:00Z">
+      <w:del w:id="123" w:author="Menon, Sunita (NIH/NCI) [C]" w:date="2021-06-13T23:50:00Z">
         <w:r>
           <w:rPr>
             <w:rFonts w:ascii="Courier" w:hAnsi="Courier"/>
@@ -6931,7 +7276,7 @@
         </w:rPr>
         <w:t>.</w:t>
       </w:r>
-      <w:ins w:id="95" w:author="Menon, Sunita (NIH/NCI) [C]" w:date="2021-06-13T23:50:00Z">
+      <w:ins w:id="124" w:author="Menon, Sunita (NIH/NCI) [C]" w:date="2021-06-13T23:50:00Z">
         <w:r>
           <w:rPr>
             <w:rFonts w:ascii="Courier" w:hAnsi="Courier"/>
@@ -6941,7 +7286,7 @@
           <w:t>8</w:t>
         </w:r>
       </w:ins>
-      <w:del w:id="96" w:author="Menon, Sunita (NIH/NCI) [C]" w:date="2021-06-13T23:50:00Z">
+      <w:del w:id="125" w:author="Menon, Sunita (NIH/NCI) [C]" w:date="2021-06-13T23:50:00Z">
         <w:r>
           <w:rPr>
             <w:rFonts w:ascii="Courier" w:hAnsi="Courier"/>
@@ -7092,11 +7437,11 @@
       <w:pPr>
         <w:pStyle w:val="Heading1"/>
       </w:pPr>
-      <w:bookmarkStart w:id="97" w:name="_Toc505280683"/>
+      <w:bookmarkStart w:id="126" w:name="_Toc505280683"/>
       <w:r>
         <w:t>Eclipse</w:t>
       </w:r>
-      <w:bookmarkEnd w:id="97"/>
+      <w:bookmarkEnd w:id="126"/>
     </w:p>
     <w:p>
       <w:pPr>
@@ -7175,6 +7520,7 @@
         <w:t xml:space="preserve"> </w:t>
       </w:r>
       <w:proofErr w:type="spellStart"/>
+      <w:proofErr w:type="gramStart"/>
       <w:r>
         <w:rPr>
           <w:rFonts w:ascii="Courier" w:hAnsi="Courier"/>
@@ -7184,6 +7530,7 @@
         <w:t>eclipse:eclipse</w:t>
       </w:r>
       <w:proofErr w:type="spellEnd"/>
+      <w:proofErr w:type="gramEnd"/>
     </w:p>
     <w:p>
       <w:pPr>
@@ -7254,6 +7601,7 @@
         <w:t xml:space="preserve"> </w:t>
       </w:r>
       <w:proofErr w:type="spellStart"/>
+      <w:proofErr w:type="gramStart"/>
       <w:r>
         <w:rPr>
           <w:rFonts w:ascii="Courier" w:hAnsi="Courier"/>
@@ -7263,6 +7611,7 @@
         <w:t>eclipse:eclipse</w:t>
       </w:r>
       <w:proofErr w:type="spellEnd"/>
+      <w:proofErr w:type="gramEnd"/>
     </w:p>
     <w:p>
       <w:pPr>
@@ -7294,7 +7643,7 @@
       <w:pPr>
         <w:ind w:left="216"/>
       </w:pPr>
-      <w:hyperlink r:id="rId19" w:history="1">
+      <w:hyperlink r:id="rId18" w:history="1">
         <w:r>
           <w:rPr>
             <w:rStyle w:val="Hyperlink"/>
@@ -7378,7 +7727,7 @@
                     <pic:cNvPicPr/>
                   </pic:nvPicPr>
                   <pic:blipFill>
-                    <a:blip r:embed="rId20">
+                    <a:blip r:embed="rId19">
                       <a:extLst>
                         <a:ext uri="{28A0092B-C50C-407E-A947-70E740481C1C}">
                           <a14:useLocalDpi xmlns:a14="http://schemas.microsoft.com/office/drawing/2010/main" val="0"/>
@@ -7477,8 +7826,8 @@
       </w:pPr>
     </w:p>
     <w:sectPr>
-      <w:headerReference w:type="default" r:id="rId21"/>
-      <w:footerReference w:type="default" r:id="rId22"/>
+      <w:headerReference w:type="default" r:id="rId20"/>
+      <w:footerReference w:type="default" r:id="rId21"/>
       <w:pgSz w:w="12240" w:h="15840" w:code="1"/>
       <w:pgMar w:top="720" w:right="1440" w:bottom="720" w:left="1440" w:header="432" w:footer="432" w:gutter="0"/>
       <w:cols w:space="720"/>
@@ -10104,6 +10453,9 @@
 <w15:people xmlns:wpc="http://schemas.microsoft.com/office/word/2010/wordprocessingCanvas" xmlns:cx="http://schemas.microsoft.com/office/drawing/2014/chartex" xmlns:cx1="http://schemas.microsoft.com/office/drawing/2015/9/8/chartex" xmlns:cx2="http://schemas.microsoft.com/office/drawing/2015/10/21/chartex" xmlns:cx3="http://schemas.microsoft.com/office/drawing/2016/5/9/chartex" xmlns:cx4="http://schemas.microsoft.com/office/drawing/2016/5/10/chartex" xmlns:cx5="http://schemas.microsoft.com/office/drawing/2016/5/11/chartex" xmlns:cx6="http://schemas.microsoft.com/office/drawing/2016/5/12/chartex" xmlns:cx7="http://schemas.microsoft.com/office/drawing/2016/5/13/chartex" xmlns:cx8="http://schemas.microsoft.com/office/drawing/2016/5/14/chartex" xmlns:mc="http://schemas.openxmlformats.org/markup-compatibility/2006" xmlns:aink="http://schemas.microsoft.com/office/drawing/2016/ink" xmlns:am3d="http://schemas.microsoft.com/office/drawing/2017/model3d" xmlns:o="urn:schemas-microsoft-com:office:office" xmlns:r="http://schemas.openxmlformats.org/officeDocument/2006/relationships" xmlns:m="http://schemas.openxmlformats.org/officeDocument/2006/math" xmlns:v="urn:schemas-microsoft-com:vml" xmlns:wp14="http://schemas.microsoft.com/office/word/2010/wordprocessingDrawing" xmlns:wp="http://schemas.openxmlformats.org/drawingml/2006/wordprocessingDrawing" xmlns:w10="urn:schemas-microsoft-com:office:word" xmlns:w="http://schemas.openxmlformats.org/wordprocessingml/2006/main" xmlns:w14="http://schemas.microsoft.com/office/word/2010/wordml" xmlns:w15="http://schemas.microsoft.com/office/word/2012/wordml" xmlns:w16cex="http://schemas.microsoft.com/office/word/2018/wordml/cex" xmlns:w16cid="http://schemas.microsoft.com/office/word/2016/wordml/cid" xmlns:w16="http://schemas.microsoft.com/office/word/2018/wordml" xmlns:w16se="http://schemas.microsoft.com/office/word/2015/wordml/symex" xmlns:wpg="http://schemas.microsoft.com/office/word/2010/wordprocessingGroup" xmlns:wpi="http://schemas.microsoft.com/office/word/2010/wordprocessingInk" xmlns:wne="http://schemas.microsoft.com/office/word/2006/wordml" xmlns:wps="http://schemas.microsoft.com/office/word/2010/wordprocessingShape" mc:Ignorable="w14 w15 w16se w16cid w16 w16cex wp14">
   <w15:person w15:author="Menon, Sunita (NIH/NCI) [C]">
     <w15:presenceInfo w15:providerId="AD" w15:userId="S::menons2@nih.gov::758ef455-cee4-484e-950b-e649d9c01c48"/>
+  </w15:person>
+  <w15:person w15:author="Chintala, Sarada (NIH/NCI) [C]">
+    <w15:presenceInfo w15:providerId="AD" w15:userId="S::schintal@nih.gov::c7d500ee-430a-40e2-b1da-f721666004bb"/>
   </w15:person>
 </w15:people>
 </file>
@@ -11630,6 +11982,15 @@
       <w:shd w:val="clear" w:color="auto" w:fill="E6E6E6"/>
     </w:rPr>
   </w:style>
+  <w:style w:type="character" w:styleId="UnresolvedMention">
+    <w:name w:val="Unresolved Mention"/>
+    <w:basedOn w:val="DefaultParagraphFont"/>
+    <w:rsid w:val="00194274"/>
+    <w:rPr>
+      <w:color w:val="605E5C"/>
+      <w:shd w:val="clear" w:color="auto" w:fill="E1DFDD"/>
+    </w:rPr>
+  </w:style>
 </w:styles>
 </file>
 
@@ -11954,6 +12315,15 @@
 </file>
 
 <file path=customXml/item1.xml><?xml version="1.0" encoding="utf-8"?>
+<?mso-contentType ?>
+<FormTemplates xmlns="http://schemas.microsoft.com/sharepoint/v3/contenttype/forms">
+  <Display>DocumentLibraryForm</Display>
+  <Edit>DocumentLibraryForm</Edit>
+  <New>DocumentLibraryForm</New>
+</FormTemplates>
+</file>
+
+<file path=customXml/item2.xml><?xml version="1.0" encoding="utf-8"?>
 <ct:contentTypeSchema xmlns:ct="http://schemas.microsoft.com/office/2006/metadata/contentType" xmlns:ma="http://schemas.microsoft.com/office/2006/metadata/properties/metaAttributes" ct:_="" ma:_="" ma:contentTypeName="Document" ma:contentTypeID="0x01010024D1768208899D418F028F6C3AF82400" ma:contentTypeVersion="1" ma:contentTypeDescription="Create a new document." ma:contentTypeScope="" ma:versionID="520fa819e570fd115ba5fb6b06c1191a">
   <xsd:schema xmlns:xsd="http://www.w3.org/2001/XMLSchema" xmlns:p="http://schemas.microsoft.com/office/2006/metadata/properties" targetNamespace="http://schemas.microsoft.com/office/2006/metadata/properties" ma:root="true" ma:fieldsID="4aeb20c0e3442673af7ee10786458764">
     <xsd:element name="properties">
@@ -12002,16 +12372,15 @@
 </ct:contentTypeSchema>
 </file>
 
-<file path=customXml/item2.xml><?xml version="1.0" encoding="utf-8"?>
-<?mso-contentType ?>
-<FormTemplates xmlns="http://schemas.microsoft.com/sharepoint/v3/contenttype/forms">
-  <Display>DocumentLibraryForm</Display>
-  <Edit>DocumentLibraryForm</Edit>
-  <New>DocumentLibraryForm</New>
-</FormTemplates>
+<file path=customXml/itemProps1.xml><?xml version="1.0" encoding="utf-8"?>
+<ds:datastoreItem xmlns:ds="http://schemas.openxmlformats.org/officeDocument/2006/customXml" ds:itemID="{8D35C508-92B7-4418-B10D-4D3E815FA5E6}">
+  <ds:schemaRefs>
+    <ds:schemaRef ds:uri="http://schemas.microsoft.com/sharepoint/v3/contenttype/forms"/>
+  </ds:schemaRefs>
+</ds:datastoreItem>
 </file>
 
-<file path=customXml/itemProps1.xml><?xml version="1.0" encoding="utf-8"?>
+<file path=customXml/itemProps2.xml><?xml version="1.0" encoding="utf-8"?>
 <ds:datastoreItem xmlns:ds="http://schemas.openxmlformats.org/officeDocument/2006/customXml" ds:itemID="{177C7043-315B-4994-8586-66F83B23A7BB}">
   <ds:schemaRefs>
     <ds:schemaRef ds:uri="http://schemas.microsoft.com/office/2006/metadata/contentType"/>
@@ -12024,12 +12393,4 @@
     <ds:schemaRef ds:uri="http://schemas.microsoft.com/office/internal/2005/internalDocumentation"/>
   </ds:schemaRefs>
 </ds:datastoreItem>
-</file>
-
-<file path=customXml/itemProps2.xml><?xml version="1.0" encoding="utf-8"?>
-<ds:datastoreItem xmlns:ds="http://schemas.openxmlformats.org/officeDocument/2006/customXml" ds:itemID="{8D35C508-92B7-4418-B10D-4D3E815FA5E6}">
-  <ds:schemaRefs>
-    <ds:schemaRef ds:uri="http://schemas.microsoft.com/sharepoint/v3/contenttype/forms"/>
-  </ds:schemaRefs>
-</ds:datastoreItem>
 </file>
</xml_diff>